<commit_message>
refactor: prune legacy RSI and ADX indicators, establishing pure institutional SMC + MSE + FRVP + CSM architecture
</commit_message>
<xml_diff>
--- a/TECHNICAL_SPECIFICATION_2_STAGE_QUANT_FUNNEL.docx
+++ b/TECHNICAL_SPECIFICATION_2_STAGE_QUANT_FUNNEL.docx
@@ -22,9 +22,9 @@
       <w:r>
         <w:rPr>
           <w:color w:val="1E3A8A"/>
-          <w:sz w:val="26"/>
+          <w:sz w:val="24"/>
         </w:rPr>
-        <w:t>2-Stage Quant Funnel Multi-LLM Consensus Autonomous Trading System</w:t>
+        <w:t>2-Stage Quant Funnel Multi-LLM Consensus Autonomous Trading System (Strict Unanimous 3/3 &amp; Dual-Directional Equivalence)</w:t>
       </w:r>
     </w:p>
     <w:tbl>
@@ -267,7 +267,7 @@
                 <w:color w:val="1E293B"/>
                 <w:sz w:val="17"/>
               </w:rPr>
-              <w:t>AI Consensus Architecture</w:t>
+              <w:t>Consensus Protocol</w:t>
             </w:r>
           </w:p>
         </w:tc>
@@ -291,7 +291,7 @@
                 <w:color w:val="1E293B"/>
                 <w:sz w:val="17"/>
               </w:rPr>
-              <w:t>AI_FIXED_MODE = 'triple' (Pass 1: OpenAI o4-mini + Gemini 3.1-Flash | Pass 2: DeepSeek V4-Flash CRO)</w:t>
+              <w:t>Strict Unanimous 3/3 Rule (Wajib 3/3 Model Searah; 2/3 atau Split = HOLD Otomatis)</w:t>
             </w:r>
           </w:p>
         </w:tc>
@@ -317,7 +317,7 @@
                 <w:color w:val="1E293B"/>
                 <w:sz w:val="17"/>
               </w:rPr>
-              <w:t>Zona Waktu &amp; Siklus Operasi</w:t>
+              <w:t>Symmetry Architecture</w:t>
             </w:r>
           </w:p>
         </w:tc>
@@ -341,7 +341,7 @@
                 <w:color w:val="1E293B"/>
                 <w:sz w:val="17"/>
               </w:rPr>
-              <w:t>Asia/Jakarta (WIB = GMT+7, MT5 Server GMT+3 + 4 Jam, Rollover Tepat 04:00 WIB)</w:t>
+              <w:t>Dual-Directional Equivalence (100% Simetris BUY &amp; SELL Logic Gates, SBR/RBS, CSM Matrix)</w:t>
             </w:r>
           </w:p>
         </w:tc>
@@ -367,7 +367,7 @@
                 <w:color w:val="1E293B"/>
                 <w:sz w:val="17"/>
               </w:rPr>
-              <w:t>Repository &amp; Branch</w:t>
+              <w:t>Zona Waktu &amp; Siklus Operasi</w:t>
             </w:r>
           </w:p>
         </w:tc>
@@ -391,7 +391,7 @@
                 <w:color w:val="1E293B"/>
                 <w:sz w:val="17"/>
               </w:rPr>
-              <w:t>https://github.com/rizukid14/tradingpartnerXAU (Branch: quant-trade)</w:t>
+              <w:t>Asia/Jakarta (WIB = GMT+7, MT5 Server GMT+3 + 4 Jam, Rollover Tepat 04:00 WIB)</w:t>
             </w:r>
           </w:p>
         </w:tc>
@@ -414,12 +414,12 @@
           <w:color w:val="0F172A"/>
           <w:sz w:val="30"/>
         </w:rPr>
-        <w:t>Bab 1: Executive Architecture &amp; High-Level Design</w:t>
+        <w:t>Bab 1: Executive Architecture &amp; Funnel Overview</w:t>
       </w:r>
     </w:p>
     <w:p>
       <w:r>
-        <w:t>Sistem trading ini dirancang untuk memecahkan dilema klasik dalam algorithmic AI trading: pemindaian frekuensi tinggi (High-Frequency Market Scanning) membutuhkan kecepatan komputasi sub-detik tanpa biaya token, sedangkan keputusan eksekusi order membutuhkan kedalaman penalaran kognitif tingkat tinggi (High-Conviction Neural Reasoning).</w:t>
+        <w:t>Sistem trading ini memisahkan pemindaian pasar berfrekuensi tinggi (Stage 1 Fast Radar 60 detik) dari evaluasi kognitif mendalam (Stage 2 3-LLM Consensus Jury).</w:t>
       </w:r>
     </w:p>
     <w:tbl>
@@ -460,9 +460,9 @@
               <w:br/>
               <w:t>|  Universe: 27 Simbol Paralel | Sockets: MN1, W1, D1, H4, H1, M30                  |</w:t>
               <w:br/>
-              <w:t>|  [M1: Judas Sweep]    [M2: Pullback Retest]    [M3: Weekly Wall Reversal]         |</w:t>
+              <w:t>|  [M1: Judas Sweep]    [M2: Pullback Retest]    [M3: Multi-Touch Breakout Retest]  |</w:t>
               <w:br/>
-              <w:t>|  [4D Wave State FSM]  [Boitoki 8-Currency Matrix]  [Macro Strategic Engine (MSE)] |</w:t>
+              <w:t>|  [BUY: Diskon + RBS]  [SELL: Premium + SBR]    [CSM 8-Basket Dual-Horizon Flow]   |</w:t>
               <w:br/>
               <w:t>+-----------------------------------------+-----------------------------------------+</w:t>
               <w:br/>
@@ -478,9 +478,11 @@
               <w:br/>
               <w:t>|  PASS 2 (~1.5s): DeepSeek V4-Flash CRO (Devil's Advocate Audit + 24 Candle M5)    |</w:t>
               <w:br/>
-              <w:t>|  VETO GATES: 11 Bendera Risiko (Anti-Falling Knife, Systemic Dump, News Shield)   |</w:t>
+              <w:t>|  VETO GATES: 11 Bendera Risiko (Anti-Falling Knife BUY / Anti-Rocket FOMO SELL)   |</w:t>
               <w:br/>
-              <w:t>|  KONSENSUS : Skor Confidence &gt;= 1.20 | Unanimous 3/3 Split 2 Posisi (+25% Boost)  |</w:t>
+              <w:t>|  KONSENSUS : STRICT UNANIMOUS 3/3 (Wajib 3/3 Searah; Split = HOLD)                |</w:t>
+              <w:br/>
+              <w:t>|  SPLIT BOOST: Unanimous 3/3 + Confidence &gt;= 75% -&gt; 2 Tiket Posisi (+25% Boost)    |</w:t>
               <w:br/>
               <w:t>+-----------------------------------------+-----------------------------------------+</w:t>
               <w:br/>
@@ -494,9 +496,9 @@
               <w:br/>
               <w:t>|  Sizing: Risk 1.0% Equity | Floor SL: 1.3x ATR H1 (FX) / 1.8x ATR M30 (Gold)      |</w:t>
               <w:br/>
-              <w:t>|  Dynamic BEP (+15 pts Pocket) | Partial Close 50% TP1 | 2-Stage Dynamic Trailing  |</w:t>
+              <w:t>|  BUY: Trailing naik kunci Floor | SELL: Trailing turun kunci Ceiling              |</w:t>
               <w:br/>
-              <w:t>|  Peak-Aware Time-Decay Stagnation Exit | Pre-Rollover Shield (03:50-04:15 WIB)    |</w:t>
+              <w:t>|  Dynamic BEP (+15 pts Pocket) | Partial Close 50% TP1 | Pre-Rollover Shield       |</w:t>
               <w:br/>
               <w:t>+-----------------------------------------------------------------------------------+</w:t>
             </w:r>
@@ -521,12 +523,22 @@
           <w:color w:val="0F172A"/>
           <w:sz w:val="30"/>
         </w:rPr>
-        <w:t>Bab 2: Fractal Multi-Timeframe Hierarchy &amp; Symbol Universe</w:t>
+        <w:t>Bab 3: Stage 1 Radar — Trio Mekanisme Presisi (M1, M2, M3)</w:t>
       </w:r>
     </w:p>
     <w:p>
+      <w:pPr>
+        <w:pStyle w:val="Heading2"/>
+        <w:keepNext/>
+        <w:spacing w:before="280" w:after="80"/>
+      </w:pPr>
       <w:r>
-        <w:t>Sistem beroperasi pada 6 soket timeframe native MT5 secara hierarkis tanpa jeda pembacaan data disk:</w:t>
+        <w:rPr>
+          <w:b/>
+          <w:color w:val="1E3A8A"/>
+          <w:sz w:val="25"/>
+        </w:rPr>
+        <w:t>3.1 Mekanisme 1: London Judas Swing Failure (M1)</w:t>
       </w:r>
     </w:p>
     <w:tbl>
@@ -537,15 +549,14 @@
         <w:tblLook w:firstColumn="1" w:firstRow="1" w:lastColumn="0" w:lastRow="0" w:noHBand="0" w:noVBand="1" w:val="04A0"/>
       </w:tblPr>
       <w:tblGrid>
-        <w:gridCol w:w="2484"/>
-        <w:gridCol w:w="2484"/>
-        <w:gridCol w:w="2484"/>
-        <w:gridCol w:w="2484"/>
+        <w:gridCol w:w="3312"/>
+        <w:gridCol w:w="3312"/>
+        <w:gridCol w:w="3312"/>
       </w:tblGrid>
       <w:tr>
         <w:tc>
           <w:tcPr>
-            <w:tcW w:type="dxa" w:w="1584"/>
+            <w:tcW w:type="dxa" w:w="2592"/>
             <w:shd w:fill="0f172a"/>
             <w:tcMar>
               <w:top w:w="120" w:type="dxa"/>
@@ -564,13 +575,13 @@
                 <w:color w:val="FFFFFF"/>
                 <w:sz w:val="18"/>
               </w:rPr>
-              <w:t>Timeframe</w:t>
+              <w:t>Parameter / Kriteria</w:t>
             </w:r>
           </w:p>
         </w:tc>
         <w:tc>
           <w:tcPr>
-            <w:tcW w:type="dxa" w:w="1728"/>
+            <w:tcW w:type="dxa" w:w="3456"/>
             <w:shd w:fill="0f172a"/>
             <w:tcMar>
               <w:top w:w="120" w:type="dxa"/>
@@ -589,13 +600,13 @@
                 <w:color w:val="FFFFFF"/>
                 <w:sz w:val="18"/>
               </w:rPr>
-              <w:t>Kedalaman Data</w:t>
+              <w:t>Skenario BUY (Bullish Reversal)</w:t>
             </w:r>
           </w:p>
         </w:tc>
         <w:tc>
           <w:tcPr>
-            <w:tcW w:type="dxa" w:w="3888"/>
+            <w:tcW w:type="dxa" w:w="3600"/>
             <w:shd w:fill="0f172a"/>
             <w:tcMar>
               <w:top w:w="120" w:type="dxa"/>
@@ -614,13 +625,418 @@
                 <w:color w:val="FFFFFF"/>
                 <w:sz w:val="18"/>
               </w:rPr>
-              <w:t>Peran &amp; Fungsi Kuantitatif</w:t>
+              <w:t>Skenario SELL (Bearish Reversal)</w:t>
+            </w:r>
+          </w:p>
+        </w:tc>
+      </w:tr>
+      <w:tr>
+        <w:tc>
+          <w:tcPr>
+            <w:tcW w:type="dxa" w:w="2592"/>
+            <w:shd w:fill="ffffff"/>
+            <w:tcMar>
+              <w:top w:w="100" w:type="dxa"/>
+              <w:bottom w:w="100" w:type="dxa"/>
+              <w:left w:w="120" w:type="dxa"/>
+              <w:right w:w="120" w:type="dxa"/>
+            </w:tcMar>
+          </w:tcPr>
+          <w:p>
+            <w:pPr>
+              <w:spacing w:after="0"/>
+            </w:pPr>
+            <w:r>
+              <w:rPr>
+                <w:color w:val="1E293B"/>
+                <w:sz w:val="17"/>
+              </w:rPr>
+              <w:t>Level yang Disapu</w:t>
             </w:r>
           </w:p>
         </w:tc>
         <w:tc>
           <w:tcPr>
-            <w:tcW w:type="dxa" w:w="2448"/>
+            <w:tcW w:type="dxa" w:w="3456"/>
+            <w:shd w:fill="ffffff"/>
+            <w:tcMar>
+              <w:top w:w="100" w:type="dxa"/>
+              <w:bottom w:w="100" w:type="dxa"/>
+              <w:left w:w="120" w:type="dxa"/>
+              <w:right w:w="120" w:type="dxa"/>
+            </w:tcMar>
+          </w:tcPr>
+          <w:p>
+            <w:pPr>
+              <w:spacing w:after="0"/>
+            </w:pPr>
+            <w:r>
+              <w:rPr>
+                <w:color w:val="1E293B"/>
+                <w:sz w:val="17"/>
+              </w:rPr>
+              <w:t>Asian Low, Previous Day Low (PDL), atau PWL Floor.</w:t>
+            </w:r>
+          </w:p>
+        </w:tc>
+        <w:tc>
+          <w:tcPr>
+            <w:tcW w:type="dxa" w:w="3600"/>
+            <w:shd w:fill="ffffff"/>
+            <w:tcMar>
+              <w:top w:w="100" w:type="dxa"/>
+              <w:bottom w:w="100" w:type="dxa"/>
+              <w:left w:w="120" w:type="dxa"/>
+              <w:right w:w="120" w:type="dxa"/>
+            </w:tcMar>
+          </w:tcPr>
+          <w:p>
+            <w:pPr>
+              <w:spacing w:after="0"/>
+            </w:pPr>
+            <w:r>
+              <w:rPr>
+                <w:color w:val="1E293B"/>
+                <w:sz w:val="17"/>
+              </w:rPr>
+              <w:t>Asian High, Previous Day High (PDH), atau PWH Ceiling.</w:t>
+            </w:r>
+          </w:p>
+        </w:tc>
+      </w:tr>
+      <w:tr>
+        <w:tc>
+          <w:tcPr>
+            <w:tcW w:type="dxa" w:w="2592"/>
+            <w:shd w:fill="f8fafc"/>
+            <w:tcMar>
+              <w:top w:w="100" w:type="dxa"/>
+              <w:bottom w:w="100" w:type="dxa"/>
+              <w:left w:w="120" w:type="dxa"/>
+              <w:right w:w="120" w:type="dxa"/>
+            </w:tcMar>
+          </w:tcPr>
+          <w:p>
+            <w:pPr>
+              <w:spacing w:after="0"/>
+            </w:pPr>
+            <w:r>
+              <w:rPr>
+                <w:color w:val="1E293B"/>
+                <w:sz w:val="17"/>
+              </w:rPr>
+              <w:t>Jarak Penembusan (Sweep)</w:t>
+            </w:r>
+          </w:p>
+        </w:tc>
+        <w:tc>
+          <w:tcPr>
+            <w:tcW w:type="dxa" w:w="3456"/>
+            <w:shd w:fill="f8fafc"/>
+            <w:tcMar>
+              <w:top w:w="100" w:type="dxa"/>
+              <w:bottom w:w="100" w:type="dxa"/>
+              <w:left w:w="120" w:type="dxa"/>
+              <w:right w:w="120" w:type="dxa"/>
+            </w:tcMar>
+          </w:tcPr>
+          <w:p>
+            <w:pPr>
+              <w:spacing w:after="0"/>
+            </w:pPr>
+            <w:r>
+              <w:rPr>
+                <w:color w:val="1E293B"/>
+                <w:sz w:val="17"/>
+              </w:rPr>
+              <w:t>Low menembus level sebesar &gt;= 0.15x ATR(14).</w:t>
+            </w:r>
+          </w:p>
+        </w:tc>
+        <w:tc>
+          <w:tcPr>
+            <w:tcW w:type="dxa" w:w="3600"/>
+            <w:shd w:fill="f8fafc"/>
+            <w:tcMar>
+              <w:top w:w="100" w:type="dxa"/>
+              <w:bottom w:w="100" w:type="dxa"/>
+              <w:left w:w="120" w:type="dxa"/>
+              <w:right w:w="120" w:type="dxa"/>
+            </w:tcMar>
+          </w:tcPr>
+          <w:p>
+            <w:pPr>
+              <w:spacing w:after="0"/>
+            </w:pPr>
+            <w:r>
+              <w:rPr>
+                <w:color w:val="1E293B"/>
+                <w:sz w:val="17"/>
+              </w:rPr>
+              <w:t>High menembus level sebesar &gt;= 0.15x ATR(14).</w:t>
+            </w:r>
+          </w:p>
+        </w:tc>
+      </w:tr>
+      <w:tr>
+        <w:tc>
+          <w:tcPr>
+            <w:tcW w:type="dxa" w:w="2592"/>
+            <w:shd w:fill="ffffff"/>
+            <w:tcMar>
+              <w:top w:w="100" w:type="dxa"/>
+              <w:bottom w:w="100" w:type="dxa"/>
+              <w:left w:w="120" w:type="dxa"/>
+              <w:right w:w="120" w:type="dxa"/>
+            </w:tcMar>
+          </w:tcPr>
+          <w:p>
+            <w:pPr>
+              <w:spacing w:after="0"/>
+            </w:pPr>
+            <w:r>
+              <w:rPr>
+                <w:color w:val="1E293B"/>
+                <w:sz w:val="17"/>
+              </w:rPr>
+              <w:t>Reclaim Window</w:t>
+            </w:r>
+          </w:p>
+        </w:tc>
+        <w:tc>
+          <w:tcPr>
+            <w:tcW w:type="dxa" w:w="3456"/>
+            <w:shd w:fill="ffffff"/>
+            <w:tcMar>
+              <w:top w:w="100" w:type="dxa"/>
+              <w:bottom w:w="100" w:type="dxa"/>
+              <w:left w:w="120" w:type="dxa"/>
+              <w:right w:w="120" w:type="dxa"/>
+            </w:tcMar>
+          </w:tcPr>
+          <w:p>
+            <w:pPr>
+              <w:spacing w:after="0"/>
+            </w:pPr>
+            <w:r>
+              <w:rPr>
+                <w:color w:val="1E293B"/>
+                <w:sz w:val="17"/>
+              </w:rPr>
+              <w:t>Harga ditutup kembali di ATAS level dalam &lt;= 3 candle.</w:t>
+            </w:r>
+          </w:p>
+        </w:tc>
+        <w:tc>
+          <w:tcPr>
+            <w:tcW w:type="dxa" w:w="3600"/>
+            <w:shd w:fill="ffffff"/>
+            <w:tcMar>
+              <w:top w:w="100" w:type="dxa"/>
+              <w:bottom w:w="100" w:type="dxa"/>
+              <w:left w:w="120" w:type="dxa"/>
+              <w:right w:w="120" w:type="dxa"/>
+            </w:tcMar>
+          </w:tcPr>
+          <w:p>
+            <w:pPr>
+              <w:spacing w:after="0"/>
+            </w:pPr>
+            <w:r>
+              <w:rPr>
+                <w:color w:val="1E293B"/>
+                <w:sz w:val="17"/>
+              </w:rPr>
+              <w:t>Harga ditutup kembali di BAWAH level dalam &lt;= 3 candle.</w:t>
+            </w:r>
+          </w:p>
+        </w:tc>
+      </w:tr>
+      <w:tr>
+        <w:tc>
+          <w:tcPr>
+            <w:tcW w:type="dxa" w:w="2592"/>
+            <w:shd w:fill="f8fafc"/>
+            <w:tcMar>
+              <w:top w:w="100" w:type="dxa"/>
+              <w:bottom w:w="100" w:type="dxa"/>
+              <w:left w:w="120" w:type="dxa"/>
+              <w:right w:w="120" w:type="dxa"/>
+            </w:tcMar>
+          </w:tcPr>
+          <w:p>
+            <w:pPr>
+              <w:spacing w:after="0"/>
+            </w:pPr>
+            <w:r>
+              <w:rPr>
+                <w:color w:val="1E293B"/>
+                <w:sz w:val="17"/>
+              </w:rPr>
+              <w:t>Morfologi Candlestick</w:t>
+            </w:r>
+          </w:p>
+        </w:tc>
+        <w:tc>
+          <w:tcPr>
+            <w:tcW w:type="dxa" w:w="3456"/>
+            <w:shd w:fill="f8fafc"/>
+            <w:tcMar>
+              <w:top w:w="100" w:type="dxa"/>
+              <w:bottom w:w="100" w:type="dxa"/>
+              <w:left w:w="120" w:type="dxa"/>
+              <w:right w:w="120" w:type="dxa"/>
+            </w:tcMar>
+          </w:tcPr>
+          <w:p>
+            <w:pPr>
+              <w:spacing w:after="0"/>
+            </w:pPr>
+            <w:r>
+              <w:rPr>
+                <w:color w:val="1E293B"/>
+                <w:sz w:val="17"/>
+              </w:rPr>
+              <w:t>Lower Rejection Wick &gt;= 25% dari total range candle.</w:t>
+            </w:r>
+          </w:p>
+        </w:tc>
+        <w:tc>
+          <w:tcPr>
+            <w:tcW w:type="dxa" w:w="3600"/>
+            <w:shd w:fill="f8fafc"/>
+            <w:tcMar>
+              <w:top w:w="100" w:type="dxa"/>
+              <w:bottom w:w="100" w:type="dxa"/>
+              <w:left w:w="120" w:type="dxa"/>
+              <w:right w:w="120" w:type="dxa"/>
+            </w:tcMar>
+          </w:tcPr>
+          <w:p>
+            <w:pPr>
+              <w:spacing w:after="0"/>
+            </w:pPr>
+            <w:r>
+              <w:rPr>
+                <w:color w:val="1E293B"/>
+                <w:sz w:val="17"/>
+              </w:rPr>
+              <w:t>Upper Rejection Wick &gt;= 25% dari total range candle.</w:t>
+            </w:r>
+          </w:p>
+        </w:tc>
+      </w:tr>
+      <w:tr>
+        <w:tc>
+          <w:tcPr>
+            <w:tcW w:type="dxa" w:w="2592"/>
+            <w:shd w:fill="ffffff"/>
+            <w:tcMar>
+              <w:top w:w="100" w:type="dxa"/>
+              <w:bottom w:w="100" w:type="dxa"/>
+              <w:left w:w="120" w:type="dxa"/>
+              <w:right w:w="120" w:type="dxa"/>
+            </w:tcMar>
+          </w:tcPr>
+          <w:p>
+            <w:pPr>
+              <w:spacing w:after="0"/>
+            </w:pPr>
+            <w:r>
+              <w:rPr>
+                <w:color w:val="1E293B"/>
+                <w:sz w:val="17"/>
+              </w:rPr>
+              <w:t>Anti-Momentum Gate</w:t>
+            </w:r>
+          </w:p>
+        </w:tc>
+        <w:tc>
+          <w:tcPr>
+            <w:tcW w:type="dxa" w:w="3456"/>
+            <w:shd w:fill="ffffff"/>
+            <w:tcMar>
+              <w:top w:w="100" w:type="dxa"/>
+              <w:bottom w:w="100" w:type="dxa"/>
+              <w:left w:w="120" w:type="dxa"/>
+              <w:right w:w="120" w:type="dxa"/>
+            </w:tcMar>
+          </w:tcPr>
+          <w:p>
+            <w:pPr>
+              <w:spacing w:after="0"/>
+            </w:pPr>
+            <w:r>
+              <w:rPr>
+                <w:color w:val="1E293B"/>
+                <w:sz w:val="17"/>
+              </w:rPr>
+              <w:t>Anti-Waterfall: Dilarang BUY jika candle merah marubozu solid tanpa sumbu bawah.</w:t>
+            </w:r>
+          </w:p>
+        </w:tc>
+        <w:tc>
+          <w:tcPr>
+            <w:tcW w:type="dxa" w:w="3600"/>
+            <w:shd w:fill="ffffff"/>
+            <w:tcMar>
+              <w:top w:w="100" w:type="dxa"/>
+              <w:bottom w:w="100" w:type="dxa"/>
+              <w:left w:w="120" w:type="dxa"/>
+              <w:right w:w="120" w:type="dxa"/>
+            </w:tcMar>
+          </w:tcPr>
+          <w:p>
+            <w:pPr>
+              <w:spacing w:after="0"/>
+            </w:pPr>
+            <w:r>
+              <w:rPr>
+                <w:color w:val="1E293B"/>
+                <w:sz w:val="17"/>
+              </w:rPr>
+              <w:t>Anti-Skyrocket: Dilarang SELL jika candle hijau marubozu solid tanpa sumbu atas.</w:t>
+            </w:r>
+          </w:p>
+        </w:tc>
+      </w:tr>
+    </w:tbl>
+    <w:p>
+      <w:pPr>
+        <w:spacing w:after="120"/>
+      </w:pPr>
+    </w:p>
+    <w:p>
+      <w:pPr>
+        <w:pStyle w:val="Heading2"/>
+        <w:keepNext/>
+        <w:spacing w:before="280" w:after="80"/>
+      </w:pPr>
+      <w:r>
+        <w:rPr>
+          <w:b/>
+          <w:color w:val="1E3A8A"/>
+          <w:sz w:val="25"/>
+        </w:rPr>
+        <w:t>3.2 Mekanisme 2: Trend-Aligned Pullback &amp; Delayed Limit Retest (M2)</w:t>
+      </w:r>
+    </w:p>
+    <w:tbl>
+      <w:tblPr>
+        <w:tblW w:type="auto" w:w="0"/>
+        <w:jc w:val="center"/>
+        <w:tblLayout w:type="fixed"/>
+        <w:tblLook w:firstColumn="1" w:firstRow="1" w:lastColumn="0" w:lastRow="0" w:noHBand="0" w:noVBand="1" w:val="04A0"/>
+      </w:tblPr>
+      <w:tblGrid>
+        <w:gridCol w:w="3312"/>
+        <w:gridCol w:w="3312"/>
+        <w:gridCol w:w="3312"/>
+      </w:tblGrid>
+      <w:tr>
+        <w:tc>
+          <w:tcPr>
+            <w:tcW w:type="dxa" w:w="2592"/>
             <w:shd w:fill="0f172a"/>
             <w:tcMar>
               <w:top w:w="120" w:type="dxa"/>
@@ -639,7 +1055,57 @@
                 <w:color w:val="FFFFFF"/>
                 <w:sz w:val="18"/>
               </w:rPr>
-              <w:t>Eksekusi / Trigger</w:t>
+              <w:t>Parameter / Kriteria</w:t>
+            </w:r>
+          </w:p>
+        </w:tc>
+        <w:tc>
+          <w:tcPr>
+            <w:tcW w:type="dxa" w:w="3456"/>
+            <w:shd w:fill="0f172a"/>
+            <w:tcMar>
+              <w:top w:w="120" w:type="dxa"/>
+              <w:bottom w:w="120" w:type="dxa"/>
+              <w:left w:w="120" w:type="dxa"/>
+              <w:right w:w="120" w:type="dxa"/>
+            </w:tcMar>
+          </w:tcPr>
+          <w:p>
+            <w:pPr>
+              <w:spacing w:after="0"/>
+            </w:pPr>
+            <w:r>
+              <w:rPr>
+                <w:b/>
+                <w:color w:val="FFFFFF"/>
+                <w:sz w:val="18"/>
+              </w:rPr>
+              <w:t>Skenario BUY (Trend-Following Long)</w:t>
+            </w:r>
+          </w:p>
+        </w:tc>
+        <w:tc>
+          <w:tcPr>
+            <w:tcW w:type="dxa" w:w="3600"/>
+            <w:shd w:fill="0f172a"/>
+            <w:tcMar>
+              <w:top w:w="120" w:type="dxa"/>
+              <w:bottom w:w="120" w:type="dxa"/>
+              <w:left w:w="120" w:type="dxa"/>
+              <w:right w:w="120" w:type="dxa"/>
+            </w:tcMar>
+          </w:tcPr>
+          <w:p>
+            <w:pPr>
+              <w:spacing w:after="0"/>
+            </w:pPr>
+            <w:r>
+              <w:rPr>
+                <w:b/>
+                <w:color w:val="FFFFFF"/>
+                <w:sz w:val="18"/>
+              </w:rPr>
+              <w:t>Skenario SELL (Trend-Following Short)</w:t>
             </w:r>
           </w:p>
         </w:tc>
@@ -647,7 +1113,7 @@
       <w:tr>
         <w:tc>
           <w:tcPr>
-            <w:tcW w:type="dxa" w:w="1584"/>
+            <w:tcW w:type="dxa" w:w="2592"/>
             <w:shd w:fill="ffffff"/>
             <w:tcMar>
               <w:top w:w="100" w:type="dxa"/>
@@ -665,13 +1131,13 @@
                 <w:color w:val="1E293B"/>
                 <w:sz w:val="17"/>
               </w:rPr>
-              <w:t>MN1 (Monthly)</w:t>
+              <w:t>Macro Trend Alignment</w:t>
             </w:r>
           </w:p>
         </w:tc>
         <w:tc>
           <w:tcPr>
-            <w:tcW w:type="dxa" w:w="1728"/>
+            <w:tcW w:type="dxa" w:w="3456"/>
             <w:shd w:fill="ffffff"/>
             <w:tcMar>
               <w:top w:w="100" w:type="dxa"/>
@@ -689,13 +1155,13 @@
                 <w:color w:val="1E293B"/>
                 <w:sz w:val="17"/>
               </w:rPr>
-              <w:t>50 Bar (~4.1 Thn)</w:t>
+              <w:t>D1 Macro Bias BULLISH + H4 EMA50 Slope Positif (&gt; +0.5).</w:t>
             </w:r>
           </w:p>
         </w:tc>
         <w:tc>
           <w:tcPr>
-            <w:tcW w:type="dxa" w:w="3888"/>
+            <w:tcW w:type="dxa" w:w="3600"/>
             <w:shd w:fill="ffffff"/>
             <w:tcMar>
               <w:top w:w="100" w:type="dxa"/>
@@ -713,13 +1179,89 @@
                 <w:color w:val="1E293B"/>
                 <w:sz w:val="17"/>
               </w:rPr>
-              <w:t>Penetapan tren multi-dekade dan plafon resistensi mayor absolut.</w:t>
+              <w:t>D1 Macro Bias BEARISH + H4 EMA50 Slope Negatif (&lt; -0.5).</w:t>
+            </w:r>
+          </w:p>
+        </w:tc>
+      </w:tr>
+      <w:tr>
+        <w:tc>
+          <w:tcPr>
+            <w:tcW w:type="dxa" w:w="2592"/>
+            <w:shd w:fill="f8fafc"/>
+            <w:tcMar>
+              <w:top w:w="100" w:type="dxa"/>
+              <w:bottom w:w="100" w:type="dxa"/>
+              <w:left w:w="120" w:type="dxa"/>
+              <w:right w:w="120" w:type="dxa"/>
+            </w:tcMar>
+          </w:tcPr>
+          <w:p>
+            <w:pPr>
+              <w:spacing w:after="0"/>
+            </w:pPr>
+            <w:r>
+              <w:rPr>
+                <w:color w:val="1E293B"/>
+                <w:sz w:val="17"/>
+              </w:rPr>
+              <w:t>Dealing Range Location</w:t>
             </w:r>
           </w:p>
         </w:tc>
         <w:tc>
           <w:tcPr>
-            <w:tcW w:type="dxa" w:w="2448"/>
+            <w:tcW w:type="dxa" w:w="3456"/>
+            <w:shd w:fill="f8fafc"/>
+            <w:tcMar>
+              <w:top w:w="100" w:type="dxa"/>
+              <w:bottom w:w="100" w:type="dxa"/>
+              <w:left w:w="120" w:type="dxa"/>
+              <w:right w:w="120" w:type="dxa"/>
+            </w:tcMar>
+          </w:tcPr>
+          <w:p>
+            <w:pPr>
+              <w:spacing w:after="0"/>
+            </w:pPr>
+            <w:r>
+              <w:rPr>
+                <w:color w:val="1E293B"/>
+                <w:sz w:val="17"/>
+              </w:rPr>
+              <w:t>Zona Diskon: Dealing Range &lt;= 0.65 (Optimal &lt;= 0.382).</w:t>
+            </w:r>
+          </w:p>
+        </w:tc>
+        <w:tc>
+          <w:tcPr>
+            <w:tcW w:type="dxa" w:w="3600"/>
+            <w:shd w:fill="f8fafc"/>
+            <w:tcMar>
+              <w:top w:w="100" w:type="dxa"/>
+              <w:bottom w:w="100" w:type="dxa"/>
+              <w:left w:w="120" w:type="dxa"/>
+              <w:right w:w="120" w:type="dxa"/>
+            </w:tcMar>
+          </w:tcPr>
+          <w:p>
+            <w:pPr>
+              <w:spacing w:after="0"/>
+            </w:pPr>
+            <w:r>
+              <w:rPr>
+                <w:color w:val="1E293B"/>
+                <w:sz w:val="17"/>
+              </w:rPr>
+              <w:t>Zona Premium: Dealing Range &gt;= 0.35 (Optimal &gt;= 0.618).</w:t>
+            </w:r>
+          </w:p>
+        </w:tc>
+      </w:tr>
+      <w:tr>
+        <w:tc>
+          <w:tcPr>
+            <w:tcW w:type="dxa" w:w="2592"/>
             <w:shd w:fill="ffffff"/>
             <w:tcMar>
               <w:top w:w="100" w:type="dxa"/>
@@ -737,7 +1279,55 @@
                 <w:color w:val="1E293B"/>
                 <w:sz w:val="17"/>
               </w:rPr>
-              <w:t>Macro Anchor (0 Token)</w:t>
+              <w:t>Mean Proximity (EMA20)</w:t>
+            </w:r>
+          </w:p>
+        </w:tc>
+        <w:tc>
+          <w:tcPr>
+            <w:tcW w:type="dxa" w:w="3456"/>
+            <w:shd w:fill="ffffff"/>
+            <w:tcMar>
+              <w:top w:w="100" w:type="dxa"/>
+              <w:bottom w:w="100" w:type="dxa"/>
+              <w:left w:w="120" w:type="dxa"/>
+              <w:right w:w="120" w:type="dxa"/>
+            </w:tcMar>
+          </w:tcPr>
+          <w:p>
+            <w:pPr>
+              <w:spacing w:after="0"/>
+            </w:pPr>
+            <w:r>
+              <w:rPr>
+                <w:color w:val="1E293B"/>
+                <w:sz w:val="17"/>
+              </w:rPr>
+              <w:t>Harga berada di atas EMA20 dengan jarak &lt;= 0.45x ATR.</w:t>
+            </w:r>
+          </w:p>
+        </w:tc>
+        <w:tc>
+          <w:tcPr>
+            <w:tcW w:type="dxa" w:w="3600"/>
+            <w:shd w:fill="ffffff"/>
+            <w:tcMar>
+              <w:top w:w="100" w:type="dxa"/>
+              <w:bottom w:w="100" w:type="dxa"/>
+              <w:left w:w="120" w:type="dxa"/>
+              <w:right w:w="120" w:type="dxa"/>
+            </w:tcMar>
+          </w:tcPr>
+          <w:p>
+            <w:pPr>
+              <w:spacing w:after="0"/>
+            </w:pPr>
+            <w:r>
+              <w:rPr>
+                <w:color w:val="1E293B"/>
+                <w:sz w:val="17"/>
+              </w:rPr>
+              <w:t>Harga berada di bawah EMA20 dengan jarak &lt;= 0.45x ATR.</w:t>
             </w:r>
           </w:p>
         </w:tc>
@@ -745,7 +1335,7 @@
       <w:tr>
         <w:tc>
           <w:tcPr>
-            <w:tcW w:type="dxa" w:w="1584"/>
+            <w:tcW w:type="dxa" w:w="2592"/>
             <w:shd w:fill="f8fafc"/>
             <w:tcMar>
               <w:top w:w="100" w:type="dxa"/>
@@ -763,13 +1353,13 @@
                 <w:color w:val="1E293B"/>
                 <w:sz w:val="17"/>
               </w:rPr>
-              <w:t>W1 (Weekly)</w:t>
+              <w:t>Delayed Limit Entry</w:t>
             </w:r>
           </w:p>
         </w:tc>
         <w:tc>
           <w:tcPr>
-            <w:tcW w:type="dxa" w:w="1728"/>
+            <w:tcW w:type="dxa" w:w="3456"/>
             <w:shd w:fill="f8fafc"/>
             <w:tcMar>
               <w:top w:w="100" w:type="dxa"/>
@@ -787,13 +1377,13 @@
                 <w:color w:val="1E293B"/>
                 <w:sz w:val="17"/>
               </w:rPr>
-              <w:t>100 Bar (~2.0 Thn)</w:t>
+              <w:t>Buy Limit Anchor = Trigger Price - (0.20x ATR).</w:t>
             </w:r>
           </w:p>
         </w:tc>
         <w:tc>
           <w:tcPr>
-            <w:tcW w:type="dxa" w:w="3888"/>
+            <w:tcW w:type="dxa" w:w="3600"/>
             <w:shd w:fill="f8fafc"/>
             <w:tcMar>
               <w:top w:w="100" w:type="dxa"/>
@@ -811,13 +1401,89 @@
                 <w:color w:val="1E293B"/>
                 <w:sz w:val="17"/>
               </w:rPr>
-              <w:t>Penentuan Dealing Range 100-bar, Previous Week High/Low (PWH/PWL).</w:t>
+              <w:t>Sell Limit Anchor = Trigger Price + (0.20x ATR).</w:t>
+            </w:r>
+          </w:p>
+        </w:tc>
+      </w:tr>
+      <w:tr>
+        <w:tc>
+          <w:tcPr>
+            <w:tcW w:type="dxa" w:w="2592"/>
+            <w:shd w:fill="ffffff"/>
+            <w:tcMar>
+              <w:top w:w="100" w:type="dxa"/>
+              <w:bottom w:w="100" w:type="dxa"/>
+              <w:left w:w="120" w:type="dxa"/>
+              <w:right w:w="120" w:type="dxa"/>
+            </w:tcMar>
+          </w:tcPr>
+          <w:p>
+            <w:pPr>
+              <w:spacing w:after="0"/>
+            </w:pPr>
+            <w:r>
+              <w:rPr>
+                <w:color w:val="1E293B"/>
+                <w:sz w:val="17"/>
+              </w:rPr>
+              <w:t>SL Structural Anchor</w:t>
             </w:r>
           </w:p>
         </w:tc>
         <w:tc>
           <w:tcPr>
-            <w:tcW w:type="dxa" w:w="2448"/>
+            <w:tcW w:type="dxa" w:w="3456"/>
+            <w:shd w:fill="ffffff"/>
+            <w:tcMar>
+              <w:top w:w="100" w:type="dxa"/>
+              <w:bottom w:w="100" w:type="dxa"/>
+              <w:left w:w="120" w:type="dxa"/>
+              <w:right w:w="120" w:type="dxa"/>
+            </w:tcMar>
+          </w:tcPr>
+          <w:p>
+            <w:pPr>
+              <w:spacing w:after="0"/>
+            </w:pPr>
+            <w:r>
+              <w:rPr>
+                <w:color w:val="1E293B"/>
+                <w:sz w:val="17"/>
+              </w:rPr>
+              <w:t>SL = Support RBS Fisik - (0.35x ATR) - Spread.</w:t>
+            </w:r>
+          </w:p>
+        </w:tc>
+        <w:tc>
+          <w:tcPr>
+            <w:tcW w:type="dxa" w:w="3600"/>
+            <w:shd w:fill="ffffff"/>
+            <w:tcMar>
+              <w:top w:w="100" w:type="dxa"/>
+              <w:bottom w:w="100" w:type="dxa"/>
+              <w:left w:w="120" w:type="dxa"/>
+              <w:right w:w="120" w:type="dxa"/>
+            </w:tcMar>
+          </w:tcPr>
+          <w:p>
+            <w:pPr>
+              <w:spacing w:after="0"/>
+            </w:pPr>
+            <w:r>
+              <w:rPr>
+                <w:color w:val="1E293B"/>
+                <w:sz w:val="17"/>
+              </w:rPr>
+              <w:t>SL = Resistance SBR Fisik + (0.35x ATR) + Spread.</w:t>
+            </w:r>
+          </w:p>
+        </w:tc>
+      </w:tr>
+      <w:tr>
+        <w:tc>
+          <w:tcPr>
+            <w:tcW w:type="dxa" w:w="2592"/>
             <w:shd w:fill="f8fafc"/>
             <w:tcMar>
               <w:top w:w="100" w:type="dxa"/>
@@ -835,7 +1501,55 @@
                 <w:color w:val="1E293B"/>
                 <w:sz w:val="17"/>
               </w:rPr>
-              <w:t>Macro Wall Boundary</w:t>
+              <w:t>Safety Ceiling &amp; Floor</w:t>
+            </w:r>
+          </w:p>
+        </w:tc>
+        <w:tc>
+          <w:tcPr>
+            <w:tcW w:type="dxa" w:w="3456"/>
+            <w:shd w:fill="f8fafc"/>
+            <w:tcMar>
+              <w:top w:w="100" w:type="dxa"/>
+              <w:bottom w:w="100" w:type="dxa"/>
+              <w:left w:w="120" w:type="dxa"/>
+              <w:right w:w="120" w:type="dxa"/>
+            </w:tcMar>
+          </w:tcPr>
+          <w:p>
+            <w:pPr>
+              <w:spacing w:after="0"/>
+            </w:pPr>
+            <w:r>
+              <w:rPr>
+                <w:color w:val="1E293B"/>
+                <w:sz w:val="17"/>
+              </w:rPr>
+              <w:t>SL Distance: Min 1.3x ATR H1 s/d Max &lt;= 160 pts (16 pips FX).</w:t>
+            </w:r>
+          </w:p>
+        </w:tc>
+        <w:tc>
+          <w:tcPr>
+            <w:tcW w:type="dxa" w:w="3600"/>
+            <w:shd w:fill="f8fafc"/>
+            <w:tcMar>
+              <w:top w:w="100" w:type="dxa"/>
+              <w:bottom w:w="100" w:type="dxa"/>
+              <w:left w:w="120" w:type="dxa"/>
+              <w:right w:w="120" w:type="dxa"/>
+            </w:tcMar>
+          </w:tcPr>
+          <w:p>
+            <w:pPr>
+              <w:spacing w:after="0"/>
+            </w:pPr>
+            <w:r>
+              <w:rPr>
+                <w:color w:val="1E293B"/>
+                <w:sz w:val="17"/>
+              </w:rPr>
+              <w:t>SL Distance: Min 1.3x ATR H1 s/d Max &lt;= 160 pts (16 pips FX).</w:t>
             </w:r>
           </w:p>
         </w:tc>
@@ -843,7 +1557,7 @@
       <w:tr>
         <w:tc>
           <w:tcPr>
-            <w:tcW w:type="dxa" w:w="1584"/>
+            <w:tcW w:type="dxa" w:w="2592"/>
             <w:shd w:fill="ffffff"/>
             <w:tcMar>
               <w:top w:w="100" w:type="dxa"/>
@@ -861,13 +1575,13 @@
                 <w:color w:val="1E293B"/>
                 <w:sz w:val="17"/>
               </w:rPr>
-              <w:t>D1 (Daily)</w:t>
+              <w:t>Target Profit (TP)</w:t>
             </w:r>
           </w:p>
         </w:tc>
         <w:tc>
           <w:tcPr>
-            <w:tcW w:type="dxa" w:w="1728"/>
+            <w:tcW w:type="dxa" w:w="3456"/>
             <w:shd w:fill="ffffff"/>
             <w:tcMar>
               <w:top w:w="100" w:type="dxa"/>
@@ -885,13 +1599,13 @@
                 <w:color w:val="1E293B"/>
                 <w:sz w:val="17"/>
               </w:rPr>
-              <w:t>350 Bar (~1.4 Thn)</w:t>
+              <w:t>TP = Nearest Resistance Station (R:R &gt;= 1.25x s/d 3.0x SL).</w:t>
             </w:r>
           </w:p>
         </w:tc>
         <w:tc>
           <w:tcPr>
-            <w:tcW w:type="dxa" w:w="3888"/>
+            <w:tcW w:type="dxa" w:w="3600"/>
             <w:shd w:fill="ffffff"/>
             <w:tcMar>
               <w:top w:w="100" w:type="dxa"/>
@@ -909,13 +1623,125 @@
                 <w:color w:val="1E293B"/>
                 <w:sz w:val="17"/>
               </w:rPr>
-              <w:t>Daily Macro Bias, Previous Day High/Low (PDH/PDL), Daily Open (DO).</w:t>
+              <w:t>TP = Nearest Support Station (R:R &gt;= 1.25x s/d 3.0x SL).</w:t>
+            </w:r>
+          </w:p>
+        </w:tc>
+      </w:tr>
+    </w:tbl>
+    <w:p>
+      <w:pPr>
+        <w:spacing w:after="120"/>
+      </w:pPr>
+    </w:p>
+    <w:p>
+      <w:pPr>
+        <w:pStyle w:val="Heading2"/>
+        <w:keepNext/>
+        <w:spacing w:before="280" w:after="80"/>
+      </w:pPr>
+      <w:r>
+        <w:rPr>
+          <w:b/>
+          <w:color w:val="1E3A8A"/>
+          <w:sz w:val="25"/>
+        </w:rPr>
+        <w:t>3.3 Mekanisme 3: Multi-Touch Cluster Breakout &amp; Delayed Retest (M3)</w:t>
+      </w:r>
+    </w:p>
+    <w:tbl>
+      <w:tblPr>
+        <w:tblW w:type="auto" w:w="0"/>
+        <w:jc w:val="center"/>
+        <w:tblLayout w:type="fixed"/>
+        <w:tblLook w:firstColumn="1" w:firstRow="1" w:lastColumn="0" w:lastRow="0" w:noHBand="0" w:noVBand="1" w:val="04A0"/>
+      </w:tblPr>
+      <w:tblGrid>
+        <w:gridCol w:w="3312"/>
+        <w:gridCol w:w="3312"/>
+        <w:gridCol w:w="3312"/>
+      </w:tblGrid>
+      <w:tr>
+        <w:tc>
+          <w:tcPr>
+            <w:tcW w:type="dxa" w:w="2592"/>
+            <w:shd w:fill="0f172a"/>
+            <w:tcMar>
+              <w:top w:w="120" w:type="dxa"/>
+              <w:bottom w:w="120" w:type="dxa"/>
+              <w:left w:w="120" w:type="dxa"/>
+              <w:right w:w="120" w:type="dxa"/>
+            </w:tcMar>
+          </w:tcPr>
+          <w:p>
+            <w:pPr>
+              <w:spacing w:after="0"/>
+            </w:pPr>
+            <w:r>
+              <w:rPr>
+                <w:b/>
+                <w:color w:val="FFFFFF"/>
+                <w:sz w:val="18"/>
+              </w:rPr>
+              <w:t>Parameter / Kriteria</w:t>
             </w:r>
           </w:p>
         </w:tc>
         <w:tc>
           <w:tcPr>
-            <w:tcW w:type="dxa" w:w="2448"/>
+            <w:tcW w:type="dxa" w:w="3456"/>
+            <w:shd w:fill="0f172a"/>
+            <w:tcMar>
+              <w:top w:w="120" w:type="dxa"/>
+              <w:bottom w:w="120" w:type="dxa"/>
+              <w:left w:w="120" w:type="dxa"/>
+              <w:right w:w="120" w:type="dxa"/>
+            </w:tcMar>
+          </w:tcPr>
+          <w:p>
+            <w:pPr>
+              <w:spacing w:after="0"/>
+            </w:pPr>
+            <w:r>
+              <w:rPr>
+                <w:b/>
+                <w:color w:val="FFFFFF"/>
+                <w:sz w:val="18"/>
+              </w:rPr>
+              <w:t>Skenario BUY (Bullish Breakout Retest)</w:t>
+            </w:r>
+          </w:p>
+        </w:tc>
+        <w:tc>
+          <w:tcPr>
+            <w:tcW w:type="dxa" w:w="3600"/>
+            <w:shd w:fill="0f172a"/>
+            <w:tcMar>
+              <w:top w:w="120" w:type="dxa"/>
+              <w:bottom w:w="120" w:type="dxa"/>
+              <w:left w:w="120" w:type="dxa"/>
+              <w:right w:w="120" w:type="dxa"/>
+            </w:tcMar>
+          </w:tcPr>
+          <w:p>
+            <w:pPr>
+              <w:spacing w:after="0"/>
+            </w:pPr>
+            <w:r>
+              <w:rPr>
+                <w:b/>
+                <w:color w:val="FFFFFF"/>
+                <w:sz w:val="18"/>
+              </w:rPr>
+              <w:t>Skenario SELL (Bearish Breakdown Retest)</w:t>
+            </w:r>
+          </w:p>
+        </w:tc>
+      </w:tr>
+      <w:tr>
+        <w:tc>
+          <w:tcPr>
+            <w:tcW w:type="dxa" w:w="2592"/>
             <w:shd w:fill="ffffff"/>
             <w:tcMar>
               <w:top w:w="100" w:type="dxa"/>
@@ -933,7 +1759,55 @@
                 <w:color w:val="1E293B"/>
                 <w:sz w:val="17"/>
               </w:rPr>
-              <w:t>Direction Identity Anchor</w:t>
+              <w:t>Cluster Touch Count</w:t>
+            </w:r>
+          </w:p>
+        </w:tc>
+        <w:tc>
+          <w:tcPr>
+            <w:tcW w:type="dxa" w:w="3456"/>
+            <w:shd w:fill="ffffff"/>
+            <w:tcMar>
+              <w:top w:w="100" w:type="dxa"/>
+              <w:bottom w:w="100" w:type="dxa"/>
+              <w:left w:w="120" w:type="dxa"/>
+              <w:right w:w="120" w:type="dxa"/>
+            </w:tcMar>
+          </w:tcPr>
+          <w:p>
+            <w:pPr>
+              <w:spacing w:after="0"/>
+            </w:pPr>
+            <w:r>
+              <w:rPr>
+                <w:color w:val="1E293B"/>
+                <w:sz w:val="17"/>
+              </w:rPr>
+              <w:t>Cluster Resistance telah diuji &gt;= 2 kali (touches &gt;= 2).</w:t>
+            </w:r>
+          </w:p>
+        </w:tc>
+        <w:tc>
+          <w:tcPr>
+            <w:tcW w:type="dxa" w:w="3600"/>
+            <w:shd w:fill="ffffff"/>
+            <w:tcMar>
+              <w:top w:w="100" w:type="dxa"/>
+              <w:bottom w:w="100" w:type="dxa"/>
+              <w:left w:w="120" w:type="dxa"/>
+              <w:right w:w="120" w:type="dxa"/>
+            </w:tcMar>
+          </w:tcPr>
+          <w:p>
+            <w:pPr>
+              <w:spacing w:after="0"/>
+            </w:pPr>
+            <w:r>
+              <w:rPr>
+                <w:color w:val="1E293B"/>
+                <w:sz w:val="17"/>
+              </w:rPr>
+              <w:t>Cluster Support telah diuji &gt;= 2 kali (touches &gt;= 2).</w:t>
             </w:r>
           </w:p>
         </w:tc>
@@ -941,7 +1815,7 @@
       <w:tr>
         <w:tc>
           <w:tcPr>
-            <w:tcW w:type="dxa" w:w="1584"/>
+            <w:tcW w:type="dxa" w:w="2592"/>
             <w:shd w:fill="f8fafc"/>
             <w:tcMar>
               <w:top w:w="100" w:type="dxa"/>
@@ -959,13 +1833,13 @@
                 <w:color w:val="1E293B"/>
                 <w:sz w:val="17"/>
               </w:rPr>
-              <w:t>H4 (4-Hour)</w:t>
+              <w:t>Breakout Validation</w:t>
             </w:r>
           </w:p>
         </w:tc>
         <w:tc>
           <w:tcPr>
-            <w:tcW w:type="dxa" w:w="1728"/>
+            <w:tcW w:type="dxa" w:w="3456"/>
             <w:shd w:fill="f8fafc"/>
             <w:tcMar>
               <w:top w:w="100" w:type="dxa"/>
@@ -983,13 +1857,13 @@
                 <w:color w:val="1E293B"/>
                 <w:sz w:val="17"/>
               </w:rPr>
-              <w:t>400 Bar (~66 Hari)</w:t>
+              <w:t>Harga menembus di atas resistance cluster &gt;= 0.10x ATR.</w:t>
             </w:r>
           </w:p>
         </w:tc>
         <w:tc>
           <w:tcPr>
-            <w:tcW w:type="dxa" w:w="3888"/>
+            <w:tcW w:type="dxa" w:w="3600"/>
             <w:shd w:fill="f8fafc"/>
             <w:tcMar>
               <w:top w:w="100" w:type="dxa"/>
@@ -1007,13 +1881,89 @@
                 <w:color w:val="1E293B"/>
                 <w:sz w:val="17"/>
               </w:rPr>
-              <w:t>Intermediate SBR/RBS levels, SuperTrend, EMA50 Slope Direction.</w:t>
+              <w:t>Harga menembus di bawah support cluster &gt;= 0.10x ATR.</w:t>
+            </w:r>
+          </w:p>
+        </w:tc>
+      </w:tr>
+      <w:tr>
+        <w:tc>
+          <w:tcPr>
+            <w:tcW w:type="dxa" w:w="2592"/>
+            <w:shd w:fill="ffffff"/>
+            <w:tcMar>
+              <w:top w:w="100" w:type="dxa"/>
+              <w:bottom w:w="100" w:type="dxa"/>
+              <w:left w:w="120" w:type="dxa"/>
+              <w:right w:w="120" w:type="dxa"/>
+            </w:tcMar>
+          </w:tcPr>
+          <w:p>
+            <w:pPr>
+              <w:spacing w:after="0"/>
+            </w:pPr>
+            <w:r>
+              <w:rPr>
+                <w:color w:val="1E293B"/>
+                <w:sz w:val="17"/>
+              </w:rPr>
+              <w:t>Delayed Retest Entry</w:t>
             </w:r>
           </w:p>
         </w:tc>
         <w:tc>
           <w:tcPr>
-            <w:tcW w:type="dxa" w:w="2448"/>
+            <w:tcW w:type="dxa" w:w="3456"/>
+            <w:shd w:fill="ffffff"/>
+            <w:tcMar>
+              <w:top w:w="100" w:type="dxa"/>
+              <w:bottom w:w="100" w:type="dxa"/>
+              <w:left w:w="120" w:type="dxa"/>
+              <w:right w:w="120" w:type="dxa"/>
+            </w:tcMar>
+          </w:tcPr>
+          <w:p>
+            <w:pPr>
+              <w:spacing w:after="0"/>
+            </w:pPr>
+            <w:r>
+              <w:rPr>
+                <w:color w:val="1E293B"/>
+                <w:sz w:val="17"/>
+              </w:rPr>
+              <w:t>Buy Limit dipasang tepat di level cluster_resistance - 0.5x spread.</w:t>
+            </w:r>
+          </w:p>
+        </w:tc>
+        <w:tc>
+          <w:tcPr>
+            <w:tcW w:type="dxa" w:w="3600"/>
+            <w:shd w:fill="ffffff"/>
+            <w:tcMar>
+              <w:top w:w="100" w:type="dxa"/>
+              <w:bottom w:w="100" w:type="dxa"/>
+              <w:left w:w="120" w:type="dxa"/>
+              <w:right w:w="120" w:type="dxa"/>
+            </w:tcMar>
+          </w:tcPr>
+          <w:p>
+            <w:pPr>
+              <w:spacing w:after="0"/>
+            </w:pPr>
+            <w:r>
+              <w:rPr>
+                <w:color w:val="1E293B"/>
+                <w:sz w:val="17"/>
+              </w:rPr>
+              <w:t>Sell Limit dipasang tepat di level cluster_support + 0.5x spread.</w:t>
+            </w:r>
+          </w:p>
+        </w:tc>
+      </w:tr>
+      <w:tr>
+        <w:tc>
+          <w:tcPr>
+            <w:tcW w:type="dxa" w:w="2592"/>
             <w:shd w:fill="f8fafc"/>
             <w:tcMar>
               <w:top w:w="100" w:type="dxa"/>
@@ -1031,7 +1981,55 @@
                 <w:color w:val="1E293B"/>
                 <w:sz w:val="17"/>
               </w:rPr>
-              <w:t>Intermediate Trend Filter</w:t>
+              <w:t>Macro Corridor Gate</w:t>
+            </w:r>
+          </w:p>
+        </w:tc>
+        <w:tc>
+          <w:tcPr>
+            <w:tcW w:type="dxa" w:w="3456"/>
+            <w:shd w:fill="f8fafc"/>
+            <w:tcMar>
+              <w:top w:w="100" w:type="dxa"/>
+              <w:bottom w:w="100" w:type="dxa"/>
+              <w:left w:w="120" w:type="dxa"/>
+              <w:right w:w="120" w:type="dxa"/>
+            </w:tcMar>
+          </w:tcPr>
+          <w:p>
+            <w:pPr>
+              <w:spacing w:after="0"/>
+            </w:pPr>
+            <w:r>
+              <w:rPr>
+                <w:color w:val="1E293B"/>
+                <w:sz w:val="17"/>
+              </w:rPr>
+              <w:t>Macro Corridor wajib BULLISH (Dilarang trade di Bearish Corridor).</w:t>
+            </w:r>
+          </w:p>
+        </w:tc>
+        <w:tc>
+          <w:tcPr>
+            <w:tcW w:type="dxa" w:w="3600"/>
+            <w:shd w:fill="f8fafc"/>
+            <w:tcMar>
+              <w:top w:w="100" w:type="dxa"/>
+              <w:bottom w:w="100" w:type="dxa"/>
+              <w:left w:w="120" w:type="dxa"/>
+              <w:right w:w="120" w:type="dxa"/>
+            </w:tcMar>
+          </w:tcPr>
+          <w:p>
+            <w:pPr>
+              <w:spacing w:after="0"/>
+            </w:pPr>
+            <w:r>
+              <w:rPr>
+                <w:color w:val="1E293B"/>
+                <w:sz w:val="17"/>
+              </w:rPr>
+              <w:t>Macro Corridor wajib BEARISH (Dilarang trade di Bullish Corridor).</w:t>
             </w:r>
           </w:p>
         </w:tc>
@@ -1039,7 +2037,7 @@
       <w:tr>
         <w:tc>
           <w:tcPr>
-            <w:tcW w:type="dxa" w:w="1584"/>
+            <w:tcW w:type="dxa" w:w="2592"/>
             <w:shd w:fill="ffffff"/>
             <w:tcMar>
               <w:top w:w="100" w:type="dxa"/>
@@ -1057,13 +2055,13 @@
                 <w:color w:val="1E293B"/>
                 <w:sz w:val="17"/>
               </w:rPr>
-              <w:t>H1 (1-Hour)</w:t>
+              <w:t>Structural Invalidation</w:t>
             </w:r>
           </w:p>
         </w:tc>
         <w:tc>
           <w:tcPr>
-            <w:tcW w:type="dxa" w:w="1728"/>
+            <w:tcW w:type="dxa" w:w="3456"/>
             <w:shd w:fill="ffffff"/>
             <w:tcMar>
               <w:top w:w="100" w:type="dxa"/>
@@ -1081,13 +2079,13 @@
                 <w:color w:val="1E293B"/>
                 <w:sz w:val="17"/>
               </w:rPr>
-              <w:t>250 Bar (~10 Hari)</w:t>
+              <w:t>SL di balik Support RBS + 0.35x ATR + Spread (&lt;= 160 pts).</w:t>
             </w:r>
           </w:p>
         </w:tc>
         <w:tc>
           <w:tcPr>
-            <w:tcW w:type="dxa" w:w="3888"/>
+            <w:tcW w:type="dxa" w:w="3600"/>
             <w:shd w:fill="ffffff"/>
             <w:tcMar>
               <w:top w:w="100" w:type="dxa"/>
@@ -1105,227 +2103,7 @@
                 <w:color w:val="1E293B"/>
                 <w:sz w:val="17"/>
               </w:rPr>
-              <w:t>Primary Radar Execution Timeframe untuk 21 FX Majors &amp; Crosses.</w:t>
-            </w:r>
-          </w:p>
-        </w:tc>
-        <w:tc>
-          <w:tcPr>
-            <w:tcW w:type="dxa" w:w="2448"/>
-            <w:shd w:fill="ffffff"/>
-            <w:tcMar>
-              <w:top w:w="100" w:type="dxa"/>
-              <w:bottom w:w="100" w:type="dxa"/>
-              <w:left w:w="120" w:type="dxa"/>
-              <w:right w:w="120" w:type="dxa"/>
-            </w:tcMar>
-          </w:tcPr>
-          <w:p>
-            <w:pPr>
-              <w:spacing w:after="0"/>
-            </w:pPr>
-            <w:r>
-              <w:rPr>
-                <w:color w:val="1E293B"/>
-                <w:sz w:val="17"/>
-              </w:rPr>
-              <w:t>Fast Execution Trigger</w:t>
-            </w:r>
-          </w:p>
-        </w:tc>
-      </w:tr>
-      <w:tr>
-        <w:tc>
-          <w:tcPr>
-            <w:tcW w:type="dxa" w:w="1584"/>
-            <w:shd w:fill="f8fafc"/>
-            <w:tcMar>
-              <w:top w:w="100" w:type="dxa"/>
-              <w:bottom w:w="100" w:type="dxa"/>
-              <w:left w:w="120" w:type="dxa"/>
-              <w:right w:w="120" w:type="dxa"/>
-            </w:tcMar>
-          </w:tcPr>
-          <w:p>
-            <w:pPr>
-              <w:spacing w:after="0"/>
-            </w:pPr>
-            <w:r>
-              <w:rPr>
-                <w:color w:val="1E293B"/>
-                <w:sz w:val="17"/>
-              </w:rPr>
-              <w:t>M30 (30-Min)</w:t>
-            </w:r>
-          </w:p>
-        </w:tc>
-        <w:tc>
-          <w:tcPr>
-            <w:tcW w:type="dxa" w:w="1728"/>
-            <w:shd w:fill="f8fafc"/>
-            <w:tcMar>
-              <w:top w:w="100" w:type="dxa"/>
-              <w:bottom w:w="100" w:type="dxa"/>
-              <w:left w:w="120" w:type="dxa"/>
-              <w:right w:w="120" w:type="dxa"/>
-            </w:tcMar>
-          </w:tcPr>
-          <w:p>
-            <w:pPr>
-              <w:spacing w:after="0"/>
-            </w:pPr>
-            <w:r>
-              <w:rPr>
-                <w:color w:val="1E293B"/>
-                <w:sz w:val="17"/>
-              </w:rPr>
-              <w:t>200 Bar (~4 Hari)</w:t>
-            </w:r>
-          </w:p>
-        </w:tc>
-        <w:tc>
-          <w:tcPr>
-            <w:tcW w:type="dxa" w:w="3888"/>
-            <w:shd w:fill="f8fafc"/>
-            <w:tcMar>
-              <w:top w:w="100" w:type="dxa"/>
-              <w:bottom w:w="100" w:type="dxa"/>
-              <w:left w:w="120" w:type="dxa"/>
-              <w:right w:w="120" w:type="dxa"/>
-            </w:tcMar>
-          </w:tcPr>
-          <w:p>
-            <w:pPr>
-              <w:spacing w:after="0"/>
-            </w:pPr>
-            <w:r>
-              <w:rPr>
-                <w:color w:val="1E293B"/>
-                <w:sz w:val="17"/>
-              </w:rPr>
-              <w:t>Primary Radar Execution Timeframe untuk XAUUSD-ECNc &amp; JPY Crosses.</w:t>
-            </w:r>
-          </w:p>
-        </w:tc>
-        <w:tc>
-          <w:tcPr>
-            <w:tcW w:type="dxa" w:w="2448"/>
-            <w:shd w:fill="f8fafc"/>
-            <w:tcMar>
-              <w:top w:w="100" w:type="dxa"/>
-              <w:bottom w:w="100" w:type="dxa"/>
-              <w:left w:w="120" w:type="dxa"/>
-              <w:right w:w="120" w:type="dxa"/>
-            </w:tcMar>
-          </w:tcPr>
-          <w:p>
-            <w:pPr>
-              <w:spacing w:after="0"/>
-            </w:pPr>
-            <w:r>
-              <w:rPr>
-                <w:color w:val="1E293B"/>
-                <w:sz w:val="17"/>
-              </w:rPr>
-              <w:t>Gold/JPY Radar Trigger</w:t>
-            </w:r>
-          </w:p>
-        </w:tc>
-      </w:tr>
-      <w:tr>
-        <w:tc>
-          <w:tcPr>
-            <w:tcW w:type="dxa" w:w="1584"/>
-            <w:shd w:fill="ffffff"/>
-            <w:tcMar>
-              <w:top w:w="100" w:type="dxa"/>
-              <w:bottom w:w="100" w:type="dxa"/>
-              <w:left w:w="120" w:type="dxa"/>
-              <w:right w:w="120" w:type="dxa"/>
-            </w:tcMar>
-          </w:tcPr>
-          <w:p>
-            <w:pPr>
-              <w:spacing w:after="0"/>
-            </w:pPr>
-            <w:r>
-              <w:rPr>
-                <w:color w:val="1E293B"/>
-                <w:sz w:val="17"/>
-              </w:rPr>
-              <w:t>M5 (5-Min)</w:t>
-            </w:r>
-          </w:p>
-        </w:tc>
-        <w:tc>
-          <w:tcPr>
-            <w:tcW w:type="dxa" w:w="1728"/>
-            <w:shd w:fill="ffffff"/>
-            <w:tcMar>
-              <w:top w:w="100" w:type="dxa"/>
-              <w:bottom w:w="100" w:type="dxa"/>
-              <w:left w:w="120" w:type="dxa"/>
-              <w:right w:w="120" w:type="dxa"/>
-            </w:tcMar>
-          </w:tcPr>
-          <w:p>
-            <w:pPr>
-              <w:spacing w:after="0"/>
-            </w:pPr>
-            <w:r>
-              <w:rPr>
-                <w:color w:val="1E293B"/>
-                <w:sz w:val="17"/>
-              </w:rPr>
-              <w:t>24 Bar (2 Jam)</w:t>
-            </w:r>
-          </w:p>
-        </w:tc>
-        <w:tc>
-          <w:tcPr>
-            <w:tcW w:type="dxa" w:w="3888"/>
-            <w:shd w:fill="ffffff"/>
-            <w:tcMar>
-              <w:top w:w="100" w:type="dxa"/>
-              <w:bottom w:w="100" w:type="dxa"/>
-              <w:left w:w="120" w:type="dxa"/>
-              <w:right w:w="120" w:type="dxa"/>
-            </w:tcMar>
-          </w:tcPr>
-          <w:p>
-            <w:pPr>
-              <w:spacing w:after="0"/>
-            </w:pPr>
-            <w:r>
-              <w:rPr>
-                <w:color w:val="1E293B"/>
-                <w:sz w:val="17"/>
-              </w:rPr>
-              <w:t>Mikroskop Audit Pass 2 DeepSeek CRO (Rejection Wicks &amp; Falling Knife).</w:t>
-            </w:r>
-          </w:p>
-        </w:tc>
-        <w:tc>
-          <w:tcPr>
-            <w:tcW w:type="dxa" w:w="2448"/>
-            <w:shd w:fill="ffffff"/>
-            <w:tcMar>
-              <w:top w:w="100" w:type="dxa"/>
-              <w:bottom w:w="100" w:type="dxa"/>
-              <w:left w:w="120" w:type="dxa"/>
-              <w:right w:w="120" w:type="dxa"/>
-            </w:tcMar>
-          </w:tcPr>
-          <w:p>
-            <w:pPr>
-              <w:spacing w:after="0"/>
-            </w:pPr>
-            <w:r>
-              <w:rPr>
-                <w:color w:val="1E293B"/>
-                <w:sz w:val="17"/>
-              </w:rPr>
-              <w:t>Pass 2 CRO Audit Only</w:t>
+              <w:t>SL di balik Resistance SBR + 0.35x ATR + Spread (&lt;= 160 pts).</w:t>
             </w:r>
           </w:p>
         </w:tc>
@@ -1348,789 +2126,7 @@
           <w:color w:val="0F172A"/>
           <w:sz w:val="30"/>
         </w:rPr>
-        <w:t>Bab 3: Stage 1 Fast Quantitative Radar &amp; Mathematical Logic Gates</w:t>
-      </w:r>
-    </w:p>
-    <w:p>
-      <w:pPr>
-        <w:pStyle w:val="Heading2"/>
-        <w:keepNext/>
-        <w:spacing w:before="280" w:after="80"/>
-      </w:pPr>
-      <w:r>
-        <w:rPr>
-          <w:b/>
-          <w:color w:val="1E3A8A"/>
-          <w:sz w:val="25"/>
-        </w:rPr>
-        <w:t>3.1 Mekanisme 1: London Judas Swing Failure (M1)</w:t>
-      </w:r>
-    </w:p>
-    <w:p>
-      <w:r>
-        <w:t>Menangkap perangkap likuiditas sesi London/New York di mana market maker menyapu batas sesi Asia, PDH, atau PDL sebelum membalikkan arah harga secara agresif.</w:t>
-      </w:r>
-    </w:p>
-    <w:tbl>
-      <w:tblPr>
-        <w:tblW w:type="auto" w:w="0"/>
-        <w:jc w:val="center"/>
-        <w:tblLayout w:type="fixed"/>
-        <w:tblLook w:firstColumn="1" w:firstRow="1" w:lastColumn="0" w:lastRow="0" w:noHBand="0" w:noVBand="1" w:val="04A0"/>
-      </w:tblPr>
-      <w:tblGrid>
-        <w:gridCol w:w="9648"/>
-      </w:tblGrid>
-      <w:tr>
-        <w:tc>
-          <w:tcPr>
-            <w:tcW w:type="dxa" w:w="9936"/>
-            <w:shd w:fill="f0fdf4"/>
-            <w:tcMar>
-              <w:top w:w="140" w:type="dxa"/>
-              <w:bottom w:w="140" w:type="dxa"/>
-              <w:left w:w="180" w:type="dxa"/>
-              <w:right w:w="180" w:type="dxa"/>
-            </w:tcMar>
-            <w:tcBorders>
-              <w:left w:val="single" w:sz="24" w:space="0" w:color="06b6d4"/>
-              <w:top w:val="none"/>
-              <w:right w:val="none"/>
-              <w:bottom w:val="none"/>
-            </w:tcBorders>
-          </w:tcPr>
-          <w:p>
-            <w:pPr>
-              <w:spacing w:after="40" w:line="276" w:lineRule="auto"/>
-            </w:pPr>
-            <w:r>
-              <w:rPr>
-                <w:b/>
-                <w:color w:val="0F172A"/>
-                <w:sz w:val="20"/>
-              </w:rPr>
-              <w:t>📌 Logic Gate &amp; Syarat Matematis Mekanisme 1 (M1)</w:t>
-              <w:br/>
-            </w:r>
-            <w:r>
-              <w:rPr>
-                <w:color w:val="1E293B"/>
-                <w:sz w:val="19"/>
-              </w:rPr>
-              <w:t>1. Jarak Sapuan: Harga menembus Asian High/Low, PDH, atau PDL sebesar &gt;= 0.15x ATR(14).</w:t>
-              <w:br/>
-              <w:t>2. Reclaim Window: Harga harus ditutup kembali (reclaim) ke dalam rentang dalam &lt;= 3 candle.</w:t>
-              <w:br/>
-              <w:t>3. Candlestick Wick Ratio: Candle pembalikan wajib memiliki Rejection Wick &gt;= 25% dari total range candle.</w:t>
-              <w:br/>
-              <w:t>4. Anti-Waterfall Gate: Dilarang keras BUY jika candle penembusan adalah Marubozu merah solid tanpa sumbu bawah.</w:t>
-            </w:r>
-          </w:p>
-        </w:tc>
-      </w:tr>
-    </w:tbl>
-    <w:p>
-      <w:pPr>
-        <w:spacing w:before="0" w:after="80"/>
-      </w:pPr>
-    </w:p>
-    <w:p>
-      <w:pPr>
-        <w:pStyle w:val="Heading2"/>
-        <w:keepNext/>
-        <w:spacing w:before="280" w:after="80"/>
-      </w:pPr>
-      <w:r>
-        <w:rPr>
-          <w:b/>
-          <w:color w:val="1E3A8A"/>
-          <w:sz w:val="25"/>
-        </w:rPr>
-        <w:t>3.2 Mekanisme 2: Trend-Aligned Pullback &amp; Delayed Limit Retest (M2)</w:t>
-      </w:r>
-    </w:p>
-    <w:p>
-      <w:r>
-        <w:t>Mekanisme utama penghasil profit terbesar (Win Rate 58.1%, PF 1.23). Membeli di zona diskon saat tren makro bullish atau menjual di zona premium saat tren makro bearish.</w:t>
-      </w:r>
-    </w:p>
-    <w:tbl>
-      <w:tblPr>
-        <w:tblW w:type="auto" w:w="0"/>
-        <w:jc w:val="center"/>
-        <w:tblLayout w:type="fixed"/>
-        <w:tblLook w:firstColumn="1" w:firstRow="1" w:lastColumn="0" w:lastRow="0" w:noHBand="0" w:noVBand="1" w:val="04A0"/>
-      </w:tblPr>
-      <w:tblGrid>
-        <w:gridCol w:w="9648"/>
-      </w:tblGrid>
-      <w:tr>
-        <w:tc>
-          <w:tcPr>
-            <w:tcW w:type="dxa" w:w="9936"/>
-            <w:shd w:fill="f0fdf4"/>
-            <w:tcMar>
-              <w:top w:w="140" w:type="dxa"/>
-              <w:bottom w:w="140" w:type="dxa"/>
-              <w:left w:w="180" w:type="dxa"/>
-              <w:right w:w="180" w:type="dxa"/>
-            </w:tcMar>
-            <w:tcBorders>
-              <w:left w:val="single" w:sz="24" w:space="0" w:color="10b981"/>
-              <w:top w:val="none"/>
-              <w:right w:val="none"/>
-              <w:bottom w:val="none"/>
-            </w:tcBorders>
-          </w:tcPr>
-          <w:p>
-            <w:pPr>
-              <w:spacing w:after="40" w:line="276" w:lineRule="auto"/>
-            </w:pPr>
-            <w:r>
-              <w:rPr>
-                <w:b/>
-                <w:color w:val="0F172A"/>
-                <w:sz w:val="20"/>
-              </w:rPr>
-              <w:t>📌 Logic Gate &amp; Syarat Matematis Mekanisme 2 (M2)</w:t>
-              <w:br/>
-            </w:r>
-            <w:r>
-              <w:rPr>
-                <w:color w:val="1E293B"/>
-                <w:sz w:val="19"/>
-              </w:rPr>
-              <w:t>1. Macro Alignment: D1 SuperTrend + H4 EMA50 slope searah dengan arah setup (BUY jika Bullish, SELL jika Bearish).</w:t>
-              <w:br/>
-              <w:t>2. Dealing Range Location: Posisi harga wajib berada di zona Diskon (&lt;= 0.65) untuk BUY, atau Premium (&gt;= 0.35) untuk SELL.</w:t>
-              <w:br/>
-              <w:t>3. Mean Pullback Proximity: Jarak harga ke EMA20 H1 wajib &lt;= 0.45x ATR (tidak mengejar impulse yang sudah overextended).</w:t>
-              <w:br/>
-              <w:t>4. Delayed Limit Retest Anchor: Order limit dipasang pada harga diskon = Trigger Price - (0.20x ATR) untuk BUY.</w:t>
-              <w:br/>
-              <w:t>5. Structural SL Anchoring: SL dipasang di balik Support SBR/RBS fisik + Anti-Wick Buffer 0.35x ATR + Spread.</w:t>
-              <w:br/>
-              <w:t>6. Hard Safety Ceiling: SL Forex dibatasi maksimal &lt;= 160 pts (16.0 pips) untuk menjaga asimetri Risk:Reward.</w:t>
-            </w:r>
-          </w:p>
-        </w:tc>
-      </w:tr>
-    </w:tbl>
-    <w:p>
-      <w:pPr>
-        <w:spacing w:before="0" w:after="80"/>
-      </w:pPr>
-    </w:p>
-    <w:p>
-      <w:pPr>
-        <w:pStyle w:val="Heading2"/>
-        <w:keepNext/>
-        <w:spacing w:before="280" w:after="80"/>
-      </w:pPr>
-      <w:r>
-        <w:rPr>
-          <w:b/>
-          <w:color w:val="1E3A8A"/>
-          <w:sz w:val="25"/>
-        </w:rPr>
-        <w:t>3.3 Mekanisme 3: HTF Weekly Wall Reversal &amp; Foothold Targeting (M3)</w:t>
-      </w:r>
-    </w:p>
-    <w:p>
-      <w:r>
-        <w:t>Menggantikan strategi usang NY ADR Reversal yang terbukti toksik. M3 mendeteksi tabrakan harga pada dinding likuiditas mingguan/bulanan (PWH/PWL/Station 100-pip) dan menargetkan pijakan di 50% Equilibrium Dealing Range.</w:t>
-      </w:r>
-    </w:p>
-    <w:p>
-      <w:pPr>
-        <w:pStyle w:val="Heading1"/>
-        <w:keepNext/>
-        <w:spacing w:before="360" w:after="120"/>
-      </w:pPr>
-      <w:r>
-        <w:rPr>
-          <w:b/>
-          <w:color w:val="0F172A"/>
-          <w:sz w:val="30"/>
-        </w:rPr>
-        <w:t>Bab 4: 4-Dimensional Market State Engine (wave_state.py)</w:t>
-      </w:r>
-    </w:p>
-    <w:p>
-      <w:r>
-        <w:t>Engine ini memisahkan secara tegas antara 'Identitas Arah' (Direction) dengan 'Izin Eksekusi' (Trade Permission). Terdiri dari 4 dimensi finite state machine:</w:t>
-      </w:r>
-    </w:p>
-    <w:tbl>
-      <w:tblPr>
-        <w:tblW w:type="auto" w:w="0"/>
-        <w:jc w:val="center"/>
-        <w:tblLayout w:type="fixed"/>
-        <w:tblLook w:firstColumn="1" w:firstRow="1" w:lastColumn="0" w:lastRow="0" w:noHBand="0" w:noVBand="1" w:val="04A0"/>
-      </w:tblPr>
-      <w:tblGrid>
-        <w:gridCol w:w="3312"/>
-        <w:gridCol w:w="3312"/>
-        <w:gridCol w:w="3312"/>
-      </w:tblGrid>
-      <w:tr>
-        <w:tc>
-          <w:tcPr>
-            <w:tcW w:type="dxa" w:w="2160"/>
-            <w:shd w:fill="0f172a"/>
-            <w:tcMar>
-              <w:top w:w="120" w:type="dxa"/>
-              <w:bottom w:w="120" w:type="dxa"/>
-              <w:left w:w="120" w:type="dxa"/>
-              <w:right w:w="120" w:type="dxa"/>
-            </w:tcMar>
-          </w:tcPr>
-          <w:p>
-            <w:pPr>
-              <w:spacing w:after="0"/>
-            </w:pPr>
-            <w:r>
-              <w:rPr>
-                <w:b/>
-                <w:color w:val="FFFFFF"/>
-                <w:sz w:val="18"/>
-              </w:rPr>
-              <w:t>Dimensi FSM</w:t>
-            </w:r>
-          </w:p>
-        </w:tc>
-        <w:tc>
-          <w:tcPr>
-            <w:tcW w:type="dxa" w:w="3168"/>
-            <w:shd w:fill="0f172a"/>
-            <w:tcMar>
-              <w:top w:w="120" w:type="dxa"/>
-              <w:bottom w:w="120" w:type="dxa"/>
-              <w:left w:w="120" w:type="dxa"/>
-              <w:right w:w="120" w:type="dxa"/>
-            </w:tcMar>
-          </w:tcPr>
-          <w:p>
-            <w:pPr>
-              <w:spacing w:after="0"/>
-            </w:pPr>
-            <w:r>
-              <w:rPr>
-                <w:b/>
-                <w:color w:val="FFFFFF"/>
-                <w:sz w:val="18"/>
-              </w:rPr>
-              <w:t>State / Klasifikasi</w:t>
-            </w:r>
-          </w:p>
-        </w:tc>
-        <w:tc>
-          <w:tcPr>
-            <w:tcW w:type="dxa" w:w="4320"/>
-            <w:shd w:fill="0f172a"/>
-            <w:tcMar>
-              <w:top w:w="120" w:type="dxa"/>
-              <w:bottom w:w="120" w:type="dxa"/>
-              <w:left w:w="120" w:type="dxa"/>
-              <w:right w:w="120" w:type="dxa"/>
-            </w:tcMar>
-          </w:tcPr>
-          <w:p>
-            <w:pPr>
-              <w:spacing w:after="0"/>
-            </w:pPr>
-            <w:r>
-              <w:rPr>
-                <w:b/>
-                <w:color w:val="FFFFFF"/>
-                <w:sz w:val="18"/>
-              </w:rPr>
-              <w:t>Deskripsi &amp; Aturan Logika</w:t>
-            </w:r>
-          </w:p>
-        </w:tc>
-      </w:tr>
-      <w:tr>
-        <w:tc>
-          <w:tcPr>
-            <w:tcW w:type="dxa" w:w="2160"/>
-            <w:shd w:fill="ffffff"/>
-            <w:tcMar>
-              <w:top w:w="100" w:type="dxa"/>
-              <w:bottom w:w="100" w:type="dxa"/>
-              <w:left w:w="120" w:type="dxa"/>
-              <w:right w:w="120" w:type="dxa"/>
-            </w:tcMar>
-          </w:tcPr>
-          <w:p>
-            <w:pPr>
-              <w:spacing w:after="0"/>
-            </w:pPr>
-            <w:r>
-              <w:rPr>
-                <w:color w:val="1E293B"/>
-                <w:sz w:val="17"/>
-              </w:rPr>
-              <w:t>Dimensi 1: Direction</w:t>
-            </w:r>
-          </w:p>
-        </w:tc>
-        <w:tc>
-          <w:tcPr>
-            <w:tcW w:type="dxa" w:w="3168"/>
-            <w:shd w:fill="ffffff"/>
-            <w:tcMar>
-              <w:top w:w="100" w:type="dxa"/>
-              <w:bottom w:w="100" w:type="dxa"/>
-              <w:left w:w="120" w:type="dxa"/>
-              <w:right w:w="120" w:type="dxa"/>
-            </w:tcMar>
-          </w:tcPr>
-          <w:p>
-            <w:pPr>
-              <w:spacing w:after="0"/>
-            </w:pPr>
-            <w:r>
-              <w:rPr>
-                <w:color w:val="1E293B"/>
-                <w:sz w:val="17"/>
-              </w:rPr>
-              <w:t>BULLISH_EXPANSION</w:t>
-              <w:br/>
-              <w:t>BEARISH_PULLBACK</w:t>
-              <w:br/>
-              <w:t>BULLISH_PULLBACK</w:t>
-              <w:br/>
-              <w:t>RANGE_BOUND</w:t>
-            </w:r>
-          </w:p>
-        </w:tc>
-        <w:tc>
-          <w:tcPr>
-            <w:tcW w:type="dxa" w:w="4320"/>
-            <w:shd w:fill="ffffff"/>
-            <w:tcMar>
-              <w:top w:w="100" w:type="dxa"/>
-              <w:bottom w:w="100" w:type="dxa"/>
-              <w:left w:w="120" w:type="dxa"/>
-              <w:right w:w="120" w:type="dxa"/>
-            </w:tcMar>
-          </w:tcPr>
-          <w:p>
-            <w:pPr>
-              <w:spacing w:after="0"/>
-            </w:pPr>
-            <w:r>
-              <w:rPr>
-                <w:color w:val="1E293B"/>
-                <w:sz w:val="17"/>
-              </w:rPr>
-              <w:t>Ditentukan oleh D1 Trend + H4 SuperTrend + Slope EMA50. Mengeliminasi False Flip dari 70.86% menjadi 12.61%.</w:t>
-            </w:r>
-          </w:p>
-        </w:tc>
-      </w:tr>
-      <w:tr>
-        <w:tc>
-          <w:tcPr>
-            <w:tcW w:type="dxa" w:w="2160"/>
-            <w:shd w:fill="f8fafc"/>
-            <w:tcMar>
-              <w:top w:w="100" w:type="dxa"/>
-              <w:bottom w:w="100" w:type="dxa"/>
-              <w:left w:w="120" w:type="dxa"/>
-              <w:right w:w="120" w:type="dxa"/>
-            </w:tcMar>
-          </w:tcPr>
-          <w:p>
-            <w:pPr>
-              <w:spacing w:after="0"/>
-            </w:pPr>
-            <w:r>
-              <w:rPr>
-                <w:color w:val="1E293B"/>
-                <w:sz w:val="17"/>
-              </w:rPr>
-              <w:t>Dimensi 2: Anatomy</w:t>
-            </w:r>
-          </w:p>
-        </w:tc>
-        <w:tc>
-          <w:tcPr>
-            <w:tcW w:type="dxa" w:w="3168"/>
-            <w:shd w:fill="f8fafc"/>
-            <w:tcMar>
-              <w:top w:w="100" w:type="dxa"/>
-              <w:bottom w:w="100" w:type="dxa"/>
-              <w:left w:w="120" w:type="dxa"/>
-              <w:right w:w="120" w:type="dxa"/>
-            </w:tcMar>
-          </w:tcPr>
-          <w:p>
-            <w:pPr>
-              <w:spacing w:after="0"/>
-            </w:pPr>
-            <w:r>
-              <w:rPr>
-                <w:color w:val="1E293B"/>
-                <w:sz w:val="17"/>
-              </w:rPr>
-              <w:t>Type A (Mean-Reverting)</w:t>
-              <w:br/>
-              <w:t>Type B (Impulse Expansion)</w:t>
-            </w:r>
-          </w:p>
-        </w:tc>
-        <w:tc>
-          <w:tcPr>
-            <w:tcW w:type="dxa" w:w="4320"/>
-            <w:shd w:fill="f8fafc"/>
-            <w:tcMar>
-              <w:top w:w="100" w:type="dxa"/>
-              <w:bottom w:w="100" w:type="dxa"/>
-              <w:left w:w="120" w:type="dxa"/>
-              <w:right w:w="120" w:type="dxa"/>
-            </w:tcMar>
-          </w:tcPr>
-          <w:p>
-            <w:pPr>
-              <w:spacing w:after="0"/>
-            </w:pPr>
-            <w:r>
-              <w:rPr>
-                <w:color w:val="1E293B"/>
-                <w:sz w:val="17"/>
-              </w:rPr>
-              <w:t>Membedakan kondisi ranging/basing dari pergerakan impulsif satu arah.</w:t>
-            </w:r>
-          </w:p>
-        </w:tc>
-      </w:tr>
-      <w:tr>
-        <w:tc>
-          <w:tcPr>
-            <w:tcW w:type="dxa" w:w="2160"/>
-            <w:shd w:fill="ffffff"/>
-            <w:tcMar>
-              <w:top w:w="100" w:type="dxa"/>
-              <w:bottom w:w="100" w:type="dxa"/>
-              <w:left w:w="120" w:type="dxa"/>
-              <w:right w:w="120" w:type="dxa"/>
-            </w:tcMar>
-          </w:tcPr>
-          <w:p>
-            <w:pPr>
-              <w:spacing w:after="0"/>
-            </w:pPr>
-            <w:r>
-              <w:rPr>
-                <w:color w:val="1E293B"/>
-                <w:sz w:val="17"/>
-              </w:rPr>
-              <w:t>Dimensi 3: CSM Flow</w:t>
-            </w:r>
-          </w:p>
-        </w:tc>
-        <w:tc>
-          <w:tcPr>
-            <w:tcW w:type="dxa" w:w="3168"/>
-            <w:shd w:fill="ffffff"/>
-            <w:tcMar>
-              <w:top w:w="100" w:type="dxa"/>
-              <w:bottom w:w="100" w:type="dxa"/>
-              <w:left w:w="120" w:type="dxa"/>
-              <w:right w:w="120" w:type="dxa"/>
-            </w:tcMar>
-          </w:tcPr>
-          <w:p>
-            <w:pPr>
-              <w:spacing w:after="0"/>
-            </w:pPr>
-            <w:r>
-              <w:rPr>
-                <w:color w:val="1E293B"/>
-                <w:sz w:val="17"/>
-              </w:rPr>
-              <w:t>ALIGNED (+68.4% edge)</w:t>
-              <w:br/>
-              <w:t>OPPOSED (64.0% fail)</w:t>
-            </w:r>
-          </w:p>
-        </w:tc>
-        <w:tc>
-          <w:tcPr>
-            <w:tcW w:type="dxa" w:w="4320"/>
-            <w:shd w:fill="ffffff"/>
-            <w:tcMar>
-              <w:top w:w="100" w:type="dxa"/>
-              <w:bottom w:w="100" w:type="dxa"/>
-              <w:left w:w="120" w:type="dxa"/>
-              <w:right w:w="120" w:type="dxa"/>
-            </w:tcMar>
-          </w:tcPr>
-          <w:p>
-            <w:pPr>
-              <w:spacing w:after="0"/>
-            </w:pPr>
-            <w:r>
-              <w:rPr>
-                <w:color w:val="1E293B"/>
-                <w:sz w:val="17"/>
-              </w:rPr>
-              <w:t>Arus modal mata uang dasar vs kutipan berdasarkan matriks 8-basket Boitoki.</w:t>
-            </w:r>
-          </w:p>
-        </w:tc>
-      </w:tr>
-      <w:tr>
-        <w:tc>
-          <w:tcPr>
-            <w:tcW w:type="dxa" w:w="2160"/>
-            <w:shd w:fill="f8fafc"/>
-            <w:tcMar>
-              <w:top w:w="100" w:type="dxa"/>
-              <w:bottom w:w="100" w:type="dxa"/>
-              <w:left w:w="120" w:type="dxa"/>
-              <w:right w:w="120" w:type="dxa"/>
-            </w:tcMar>
-          </w:tcPr>
-          <w:p>
-            <w:pPr>
-              <w:spacing w:after="0"/>
-            </w:pPr>
-            <w:r>
-              <w:rPr>
-                <w:color w:val="1E293B"/>
-                <w:sz w:val="17"/>
-              </w:rPr>
-              <w:t>Dimensi 4: Permission</w:t>
-            </w:r>
-          </w:p>
-        </w:tc>
-        <w:tc>
-          <w:tcPr>
-            <w:tcW w:type="dxa" w:w="3168"/>
-            <w:shd w:fill="f8fafc"/>
-            <w:tcMar>
-              <w:top w:w="100" w:type="dxa"/>
-              <w:bottom w:w="100" w:type="dxa"/>
-              <w:left w:w="120" w:type="dxa"/>
-              <w:right w:w="120" w:type="dxa"/>
-            </w:tcMar>
-          </w:tcPr>
-          <w:p>
-            <w:pPr>
-              <w:spacing w:after="0"/>
-            </w:pPr>
-            <w:r>
-              <w:rPr>
-                <w:color w:val="1E293B"/>
-                <w:sz w:val="17"/>
-              </w:rPr>
-              <w:t>WAIT (Phase 1: Impulse)</w:t>
-              <w:br/>
-              <w:t>LOCK (Phase 2: Waterfall)</w:t>
-              <w:br/>
-              <w:t>WATCH (Early Basing)</w:t>
-              <w:br/>
-              <w:t>ARM (Mature Basing)</w:t>
-              <w:br/>
-              <w:t>GO (Base Reclaim)</w:t>
-            </w:r>
-          </w:p>
-        </w:tc>
-        <w:tc>
-          <w:tcPr>
-            <w:tcW w:type="dxa" w:w="4320"/>
-            <w:shd w:fill="f8fafc"/>
-            <w:tcMar>
-              <w:top w:w="100" w:type="dxa"/>
-              <w:bottom w:w="100" w:type="dxa"/>
-              <w:left w:w="120" w:type="dxa"/>
-              <w:right w:w="120" w:type="dxa"/>
-            </w:tcMar>
-          </w:tcPr>
-          <w:p>
-            <w:pPr>
-              <w:spacing w:after="0"/>
-            </w:pPr>
-            <w:r>
-              <w:rPr>
-                <w:color w:val="1E293B"/>
-                <w:sz w:val="17"/>
-              </w:rPr>
-              <w:t>Hanya state ARM dan GO yang diberikan izin (Permission = True) untuk memanggil LLM Jury di Stage 2.</w:t>
-            </w:r>
-          </w:p>
-        </w:tc>
-      </w:tr>
-    </w:tbl>
-    <w:p>
-      <w:pPr>
-        <w:spacing w:after="120"/>
-      </w:pPr>
-    </w:p>
-    <w:p>
-      <w:pPr>
-        <w:pStyle w:val="Heading1"/>
-        <w:keepNext/>
-        <w:spacing w:before="360" w:after="120"/>
-      </w:pPr>
-      <w:r>
-        <w:rPr>
-          <w:b/>
-          <w:color w:val="0F172A"/>
-          <w:sz w:val="30"/>
-        </w:rPr>
-        <w:t>Bab 5: Universal 8-Currency Basket Circuit Breaker (currency_strength.py)</w:t>
-      </w:r>
-    </w:p>
-    <w:p>
-      <w:r>
-        <w:t>Mengimplementasikan algoritma Boitoki Currency Strength Matrix yang dimodifikasi secara dual-horizon mencakup seluruh 8 mata uang utama:</w:t>
-      </w:r>
-    </w:p>
-    <w:tbl>
-      <w:tblPr>
-        <w:tblW w:type="auto" w:w="0"/>
-        <w:jc w:val="center"/>
-        <w:tblLayout w:type="fixed"/>
-        <w:tblLook w:firstColumn="1" w:firstRow="1" w:lastColumn="0" w:lastRow="0" w:noHBand="0" w:noVBand="1" w:val="04A0"/>
-      </w:tblPr>
-      <w:tblGrid>
-        <w:gridCol w:w="9648"/>
-      </w:tblGrid>
-      <w:tr>
-        <w:tc>
-          <w:tcPr>
-            <w:tcW w:type="dxa" w:w="9936"/>
-            <w:shd w:fill="0f172a"/>
-            <w:tcMar>
-              <w:top w:w="140" w:type="dxa"/>
-              <w:bottom w:w="140" w:type="dxa"/>
-              <w:left w:w="180" w:type="dxa"/>
-              <w:right w:w="180" w:type="dxa"/>
-            </w:tcMar>
-          </w:tcPr>
-          <w:p>
-            <w:pPr>
-              <w:spacing w:after="0" w:line="276" w:lineRule="auto"/>
-            </w:pPr>
-            <w:r>
-              <w:rPr>
-                <w:rFonts w:ascii="Consolas" w:hAnsi="Consolas"/>
-                <w:color w:val="E2E8F0"/>
-                <w:sz w:val="17"/>
-              </w:rPr>
-              <w:t>// Formulasi Logaritmik Kekuatan Mata Uang Boitoki CSM</w:t>
-              <w:br/>
-              <w:t>Score(Currency) = ln(Price_Current / Price_Lookback) * 10000.0 - Average(All 8 Currencies)</w:t>
-              <w:br/>
-              <w:br/>
-              <w:t>// Dual-Horizon Session Weighting</w:t>
-              <w:br/>
-              <w:t>Effective_Score = (0.40 * Score_H1 [24-bar Lookback]) + (0.60 * Score_M15 [16-bar Lookback])</w:t>
-              <w:br/>
-              <w:t>Net_Delta_Spread = Effective_Score(Base_Currency) - Effective_Score(Quote_Currency)</w:t>
-            </w:r>
-          </w:p>
-        </w:tc>
-      </w:tr>
-    </w:tbl>
-    <w:p>
-      <w:pPr>
-        <w:spacing w:before="0" w:after="80"/>
-      </w:pPr>
-    </w:p>
-    <w:p>
-      <w:r>
-        <w:t>Threshold Circuit Breaker:</w:t>
-        <w:br/>
-        <w:t>1. Systemic Dump Gate (Score &lt;= -20.0): Kunci mati (Hard Lock) posisi BUY pada mata uang yang mengalami systemic crash.</w:t>
-        <w:br/>
-        <w:t>2. Systemic Surge Gate (Score &gt;= +20.0): Kunci mati (Hard Lock) posisi SELL pada mata uang yang mengalami systemic rally.</w:t>
-        <w:br/>
-        <w:t>3. Relative Spread Delta Gate (|Net Delta| &gt;= 18.0): Melarang keras entri melawan arus modal institusional dominan.</w:t>
-      </w:r>
-    </w:p>
-    <w:p>
-      <w:pPr>
-        <w:pStyle w:val="Heading1"/>
-        <w:keepNext/>
-        <w:spacing w:before="360" w:after="120"/>
-      </w:pPr>
-      <w:r>
-        <w:rPr>
-          <w:b/>
-          <w:color w:val="0F172A"/>
-          <w:sz w:val="30"/>
-        </w:rPr>
-        <w:t>Bab 6: Pure Quant Macro Strategic Engine (MSE) &amp; Station Delivery</w:t>
-      </w:r>
-    </w:p>
-    <w:p>
-      <w:r>
-        <w:t>MSE (src/analytics/macro_strategic_engine.py) bertindak sebagai 'GPS visual institusional' yang memetakan pasar ke dalam koridor terstruktur:</w:t>
-      </w:r>
-    </w:p>
-    <w:p>
-      <w:r>
-        <w:t>• Dual-Grid Psychological Stations: Membagi pergerakan harga ke dalam grid 100-pip Major Stations dan sub-grid 50-pip Estafet Sub-Stations.</w:t>
-        <w:br/>
-        <w:t>• Zonal SBR &amp; RBS Bands: Membedakan Proximal Band (tepi terdekat harga sebagai area entri diskon) dari Distal Band (tepi terluar struktur sebagai jangkar SL mutlak).</w:t>
-        <w:br/>
-        <w:t>• Wyckoff AMD Stop-Hunt Dip: Mengkalkulasi diskon manipulasi di bawah support/resistance sebelum pergerakan ekspansi dimulai.</w:t>
-      </w:r>
-    </w:p>
-    <w:p>
-      <w:pPr>
-        <w:pStyle w:val="Heading1"/>
-        <w:keepNext/>
-        <w:spacing w:before="360" w:after="120"/>
-      </w:pPr>
-      <w:r>
-        <w:rPr>
-          <w:b/>
-          <w:color w:val="0F172A"/>
-          <w:sz w:val="30"/>
-        </w:rPr>
-        <w:t>Bab 7: LuxAlgo SMC, Liquidity Map &amp; FRVP Confluence</w:t>
-      </w:r>
-    </w:p>
-    <w:p>
-      <w:r>
-        <w:t>Sistem mengintegrasikan konsep Smart Money Concepts (SMC) dan Fixed Range Volume Profile (FRVP) untuk memberikan koordinat level institusional yang presisi:</w:t>
-      </w:r>
-    </w:p>
-    <w:p>
-      <w:r>
-        <w:t>1. Unmitigated Order Block (OB): Mendeteksi zona suplai dan permintaan H4/H1 yang belum pernah tersentuh kembali sejak terbentuk.</w:t>
-        <w:br/>
-        <w:t>2. Fair Value Gap (FVG Magnet): Mengidentifikasi area ketidakseimbangan 3-lilin sebagai magnet target Take Profit.</w:t>
-        <w:br/>
-        <w:t>3. Equal Highs / Equal Lows (EQH/EQL): Menandai kolam likuiditas retail stop-loss yang rawan disapu (*liquidity traps*).</w:t>
-        <w:br/>
-        <w:t>4. FRVP Confluence: Menginjeksi Point of Control (POC), Value Area High (VAH), dan Value Area Low (VAL) ke dalam dossier juri.</w:t>
-      </w:r>
-    </w:p>
-    <w:p>
-      <w:pPr>
-        <w:pStyle w:val="Heading1"/>
-        <w:keepNext/>
-        <w:spacing w:before="360" w:after="120"/>
-      </w:pPr>
-      <w:r>
-        <w:rPr>
-          <w:b/>
-          <w:color w:val="0F172A"/>
-          <w:sz w:val="30"/>
-        </w:rPr>
-        <w:t>Bab 8: Stage 2 Multi-LLM Consensus Jury &amp; 2-Pass Audit Protocol</w:t>
-      </w:r>
-    </w:p>
-    <w:p>
-      <w:r>
-        <w:t>Stage 2 mengevaluasi kandidat setup menggunakan panel 3 model AI dengan spesialisasi peran berbeda:</w:t>
+        <w:t>Bab 8: Stage 2 Multi-LLM Consensus Jury &amp; Strict 3/3 Protocol</w:t>
       </w:r>
     </w:p>
     <w:tbl>
@@ -2171,7 +2167,7 @@
                 <w:color w:val="0F172A"/>
                 <w:sz w:val="20"/>
               </w:rPr>
-              <w:t>📌 Protokol 2-Pass Sequential Cross-Examination</w:t>
+              <w:t>📌 Protokol Konsensus Definitif (Strict Unanimous 3/3)</w:t>
               <w:br/>
             </w:r>
             <w:r>
@@ -2179,18 +2175,24 @@
                 <w:color w:val="1E293B"/>
                 <w:sz w:val="19"/>
               </w:rPr>
-              <w:t>• PASS 1: PARALEL INVESTIGATION (~3.0 Detik)</w:t>
+              <w:t>1. Syarat Eksekusi Mutlak (Zero Tolerance Split):</w:t>
               <w:br/>
-              <w:t xml:space="preserve">  - OpenAI o4-mini: Menilai validitas struktur makro D1/H4, dealing range, dan level stasiun psikologis.</w:t>
+              <w:t xml:space="preserve">   - Wajib 3 dari 3 model aktif (OpenAI o4-mini, Gemini 3.1-Flash, DeepSeek V4-Flash) memilih arah yang sama persis (3/3 BUY atau 3/3 SELL).</w:t>
               <w:br/>
-              <w:t xml:space="preserve">  - Gemini 3.1-Flash-Lite: Menilai morfologi lilin M30/M15, sumbu penolakan, dan kecepatan arus CSM.</w:t>
+              <w:t xml:space="preserve">   - Jika ada 1 model yang memilih HOLD, REJECT, atau arah berlawanan (hasil 2/3 atau split vote) -&gt; OTOMATIS DIBATALKAN (HOLD).</w:t>
+              <w:br/>
+              <w:t xml:space="preserve">   - Sistem Weighted-Confidence 1.20 lama sudah di-DROP 100% dari consensus.py demi mencegah entri ragu-ragu.</w:t>
               <w:br/>
               <w:br/>
-              <w:t>• PASS 2: DEVIL'S ADVOCATE CRO AUDIT (~1.5 Detik)</w:t>
+              <w:t>2. Eksekusi Unanimous 3/3 High Confidence Split (+25% Boost):</w:t>
               <w:br/>
-              <w:t xml:space="preserve">  - DeepSeek V4-Flash: Menerima temuan OpenAI + Gemini dan mengauditnya secara ketat menggunakan mikroskop 24 Candle M5 Live.</w:t>
+              <w:t xml:space="preserve">   - Jika ketiga model sepakat bulat dan rata-rata Confidence &gt;= 75% serta terdapat &gt;= 2 slot MT5 kosong:</w:t>
               <w:br/>
-              <w:t xml:space="preserve">  - CRO Veto Power: Berhak mem-veto mutlak jika mendeteksi falling knife, berita mendadak, atau perangkap likuiditas.</w:t>
+              <w:t xml:space="preserve">   - Bot membuka 2 tiket posisi sekaligus @ 0.625x Base Lot (Total 1.25x bobot):</w:t>
+              <w:br/>
+              <w:t xml:space="preserve">     * Posisi #1: Menargetkan TP1 Standar (Stasiun terdekat) dengan trailing stop agresif.</w:t>
+              <w:br/>
+              <w:t xml:space="preserve">     * Posisi #2: Menargetkan TP2 Extended Target (Stasiun makro besar) dengan trailing swing bernafas.</w:t>
             </w:r>
           </w:p>
         </w:tc>
@@ -2201,2275 +2203,6 @@
         <w:spacing w:before="0" w:after="80"/>
       </w:pPr>
     </w:p>
-    <w:p>
-      <w:r>
-        <w:t>11 Bendera Hard Risk Veto:</w:t>
-      </w:r>
-    </w:p>
-    <w:tbl>
-      <w:tblPr>
-        <w:tblW w:type="auto" w:w="0"/>
-        <w:jc w:val="center"/>
-        <w:tblLayout w:type="fixed"/>
-        <w:tblLook w:firstColumn="1" w:firstRow="1" w:lastColumn="0" w:lastRow="0" w:noHBand="0" w:noVBand="1" w:val="04A0"/>
-      </w:tblPr>
-      <w:tblGrid>
-        <w:gridCol w:w="4968"/>
-        <w:gridCol w:w="4968"/>
-      </w:tblGrid>
-      <w:tr>
-        <w:tc>
-          <w:tcPr>
-            <w:tcW w:type="dxa" w:w="3168"/>
-            <w:shd w:fill="0f172a"/>
-            <w:tcMar>
-              <w:top w:w="120" w:type="dxa"/>
-              <w:bottom w:w="120" w:type="dxa"/>
-              <w:left w:w="120" w:type="dxa"/>
-              <w:right w:w="120" w:type="dxa"/>
-            </w:tcMar>
-          </w:tcPr>
-          <w:p>
-            <w:pPr>
-              <w:spacing w:after="0"/>
-            </w:pPr>
-            <w:r>
-              <w:rPr>
-                <w:b/>
-                <w:color w:val="FFFFFF"/>
-                <w:sz w:val="18"/>
-              </w:rPr>
-              <w:t>Bendera Risiko (Risk Flag)</w:t>
-            </w:r>
-          </w:p>
-        </w:tc>
-        <w:tc>
-          <w:tcPr>
-            <w:tcW w:type="dxa" w:w="6480"/>
-            <w:shd w:fill="0f172a"/>
-            <w:tcMar>
-              <w:top w:w="120" w:type="dxa"/>
-              <w:bottom w:w="120" w:type="dxa"/>
-              <w:left w:w="120" w:type="dxa"/>
-              <w:right w:w="120" w:type="dxa"/>
-            </w:tcMar>
-          </w:tcPr>
-          <w:p>
-            <w:pPr>
-              <w:spacing w:after="0"/>
-            </w:pPr>
-            <w:r>
-              <w:rPr>
-                <w:b/>
-                <w:color w:val="FFFFFF"/>
-                <w:sz w:val="18"/>
-              </w:rPr>
-              <w:t>Kriteria Pemicu Veto Otomatis</w:t>
-            </w:r>
-          </w:p>
-        </w:tc>
-      </w:tr>
-      <w:tr>
-        <w:tc>
-          <w:tcPr>
-            <w:tcW w:type="dxa" w:w="3168"/>
-            <w:shd w:fill="ffffff"/>
-            <w:tcMar>
-              <w:top w:w="100" w:type="dxa"/>
-              <w:bottom w:w="100" w:type="dxa"/>
-              <w:left w:w="120" w:type="dxa"/>
-              <w:right w:w="120" w:type="dxa"/>
-            </w:tcMar>
-          </w:tcPr>
-          <w:p>
-            <w:pPr>
-              <w:spacing w:after="0"/>
-            </w:pPr>
-            <w:r>
-              <w:rPr>
-                <w:color w:val="1E293B"/>
-                <w:sz w:val="17"/>
-              </w:rPr>
-              <w:t>COUNTER_TREND_MOMENTUM</w:t>
-            </w:r>
-          </w:p>
-        </w:tc>
-        <w:tc>
-          <w:tcPr>
-            <w:tcW w:type="dxa" w:w="6480"/>
-            <w:shd w:fill="ffffff"/>
-            <w:tcMar>
-              <w:top w:w="100" w:type="dxa"/>
-              <w:bottom w:w="100" w:type="dxa"/>
-              <w:left w:w="120" w:type="dxa"/>
-              <w:right w:w="120" w:type="dxa"/>
-            </w:tcMar>
-          </w:tcPr>
-          <w:p>
-            <w:pPr>
-              <w:spacing w:after="0"/>
-            </w:pPr>
-            <w:r>
-              <w:rPr>
-                <w:color w:val="1E293B"/>
-                <w:sz w:val="17"/>
-              </w:rPr>
-              <w:t>Melawan momentum lilin impulsif aktif tanpa adanya pelemahan volume.</w:t>
-            </w:r>
-          </w:p>
-        </w:tc>
-      </w:tr>
-      <w:tr>
-        <w:tc>
-          <w:tcPr>
-            <w:tcW w:type="dxa" w:w="3168"/>
-            <w:shd w:fill="f8fafc"/>
-            <w:tcMar>
-              <w:top w:w="100" w:type="dxa"/>
-              <w:bottom w:w="100" w:type="dxa"/>
-              <w:left w:w="120" w:type="dxa"/>
-              <w:right w:w="120" w:type="dxa"/>
-            </w:tcMar>
-          </w:tcPr>
-          <w:p>
-            <w:pPr>
-              <w:spacing w:after="0"/>
-            </w:pPr>
-            <w:r>
-              <w:rPr>
-                <w:color w:val="1E293B"/>
-                <w:sz w:val="17"/>
-              </w:rPr>
-              <w:t>FALLING_KNIFE_WATERFALL</w:t>
-            </w:r>
-          </w:p>
-        </w:tc>
-        <w:tc>
-          <w:tcPr>
-            <w:tcW w:type="dxa" w:w="6480"/>
-            <w:shd w:fill="f8fafc"/>
-            <w:tcMar>
-              <w:top w:w="100" w:type="dxa"/>
-              <w:bottom w:w="100" w:type="dxa"/>
-              <w:left w:w="120" w:type="dxa"/>
-              <w:right w:w="120" w:type="dxa"/>
-            </w:tcMar>
-          </w:tcPr>
-          <w:p>
-            <w:pPr>
-              <w:spacing w:after="0"/>
-            </w:pPr>
-            <w:r>
-              <w:rPr>
-                <w:color w:val="1E293B"/>
-                <w:sz w:val="17"/>
-              </w:rPr>
-              <w:t>Mencoba menangkap pisau jatuh saat lilin M5 ditutup marubozu merah beruntun.</w:t>
-            </w:r>
-          </w:p>
-        </w:tc>
-      </w:tr>
-      <w:tr>
-        <w:tc>
-          <w:tcPr>
-            <w:tcW w:type="dxa" w:w="3168"/>
-            <w:shd w:fill="ffffff"/>
-            <w:tcMar>
-              <w:top w:w="100" w:type="dxa"/>
-              <w:bottom w:w="100" w:type="dxa"/>
-              <w:left w:w="120" w:type="dxa"/>
-              <w:right w:w="120" w:type="dxa"/>
-            </w:tcMar>
-          </w:tcPr>
-          <w:p>
-            <w:pPr>
-              <w:spacing w:after="0"/>
-            </w:pPr>
-            <w:r>
-              <w:rPr>
-                <w:color w:val="1E293B"/>
-                <w:sz w:val="17"/>
-              </w:rPr>
-              <w:t>SYSTEMIC_CURRENCY_DUMP</w:t>
-            </w:r>
-          </w:p>
-        </w:tc>
-        <w:tc>
-          <w:tcPr>
-            <w:tcW w:type="dxa" w:w="6480"/>
-            <w:shd w:fill="ffffff"/>
-            <w:tcMar>
-              <w:top w:w="100" w:type="dxa"/>
-              <w:bottom w:w="100" w:type="dxa"/>
-              <w:left w:w="120" w:type="dxa"/>
-              <w:right w:w="120" w:type="dxa"/>
-            </w:tcMar>
-          </w:tcPr>
-          <w:p>
-            <w:pPr>
-              <w:spacing w:after="0"/>
-            </w:pPr>
-            <w:r>
-              <w:rPr>
-                <w:color w:val="1E293B"/>
-                <w:sz w:val="17"/>
-              </w:rPr>
-              <w:t>Mata uang dasar (base currency) sedang dibuang secara masif di seluruh market.</w:t>
-            </w:r>
-          </w:p>
-        </w:tc>
-      </w:tr>
-      <w:tr>
-        <w:tc>
-          <w:tcPr>
-            <w:tcW w:type="dxa" w:w="3168"/>
-            <w:shd w:fill="f8fafc"/>
-            <w:tcMar>
-              <w:top w:w="100" w:type="dxa"/>
-              <w:bottom w:w="100" w:type="dxa"/>
-              <w:left w:w="120" w:type="dxa"/>
-              <w:right w:w="120" w:type="dxa"/>
-            </w:tcMar>
-          </w:tcPr>
-          <w:p>
-            <w:pPr>
-              <w:spacing w:after="0"/>
-            </w:pPr>
-            <w:r>
-              <w:rPr>
-                <w:color w:val="1E293B"/>
-                <w:sz w:val="17"/>
-              </w:rPr>
-              <w:t>UNMITIGATED_IMPULSE_CHASE</w:t>
-            </w:r>
-          </w:p>
-        </w:tc>
-        <w:tc>
-          <w:tcPr>
-            <w:tcW w:type="dxa" w:w="6480"/>
-            <w:shd w:fill="f8fafc"/>
-            <w:tcMar>
-              <w:top w:w="100" w:type="dxa"/>
-              <w:bottom w:w="100" w:type="dxa"/>
-              <w:left w:w="120" w:type="dxa"/>
-              <w:right w:w="120" w:type="dxa"/>
-            </w:tcMar>
-          </w:tcPr>
-          <w:p>
-            <w:pPr>
-              <w:spacing w:after="0"/>
-            </w:pPr>
-            <w:r>
-              <w:rPr>
-                <w:color w:val="1E293B"/>
-                <w:sz w:val="17"/>
-              </w:rPr>
-              <w:t>Mengejar harga yang sudah berlari jauh tanpa menunggu fase retest/basing.</w:t>
-            </w:r>
-          </w:p>
-        </w:tc>
-      </w:tr>
-      <w:tr>
-        <w:tc>
-          <w:tcPr>
-            <w:tcW w:type="dxa" w:w="3168"/>
-            <w:shd w:fill="ffffff"/>
-            <w:tcMar>
-              <w:top w:w="100" w:type="dxa"/>
-              <w:bottom w:w="100" w:type="dxa"/>
-              <w:left w:w="120" w:type="dxa"/>
-              <w:right w:w="120" w:type="dxa"/>
-            </w:tcMar>
-          </w:tcPr>
-          <w:p>
-            <w:pPr>
-              <w:spacing w:after="0"/>
-            </w:pPr>
-            <w:r>
-              <w:rPr>
-                <w:color w:val="1E293B"/>
-                <w:sz w:val="17"/>
-              </w:rPr>
-              <w:t>HIGH_IMPACT_NEWS</w:t>
-            </w:r>
-          </w:p>
-        </w:tc>
-        <w:tc>
-          <w:tcPr>
-            <w:tcW w:type="dxa" w:w="6480"/>
-            <w:shd w:fill="ffffff"/>
-            <w:tcMar>
-              <w:top w:w="100" w:type="dxa"/>
-              <w:bottom w:w="100" w:type="dxa"/>
-              <w:left w:w="120" w:type="dxa"/>
-              <w:right w:w="120" w:type="dxa"/>
-            </w:tcMar>
-          </w:tcPr>
-          <w:p>
-            <w:pPr>
-              <w:spacing w:after="0"/>
-            </w:pPr>
-            <w:r>
-              <w:rPr>
-                <w:color w:val="1E293B"/>
-                <w:sz w:val="17"/>
-              </w:rPr>
-              <w:t>Terdeteksi rilis berita berimpak tinggi dalam jendela +/- 6 jam.</w:t>
-            </w:r>
-          </w:p>
-        </w:tc>
-      </w:tr>
-      <w:tr>
-        <w:tc>
-          <w:tcPr>
-            <w:tcW w:type="dxa" w:w="3168"/>
-            <w:shd w:fill="f8fafc"/>
-            <w:tcMar>
-              <w:top w:w="100" w:type="dxa"/>
-              <w:bottom w:w="100" w:type="dxa"/>
-              <w:left w:w="120" w:type="dxa"/>
-              <w:right w:w="120" w:type="dxa"/>
-            </w:tcMar>
-          </w:tcPr>
-          <w:p>
-            <w:pPr>
-              <w:spacing w:after="0"/>
-            </w:pPr>
-            <w:r>
-              <w:rPr>
-                <w:color w:val="1E293B"/>
-                <w:sz w:val="17"/>
-              </w:rPr>
-              <w:t>LIQUIDITY_TRAP</w:t>
-            </w:r>
-          </w:p>
-        </w:tc>
-        <w:tc>
-          <w:tcPr>
-            <w:tcW w:type="dxa" w:w="6480"/>
-            <w:shd w:fill="f8fafc"/>
-            <w:tcMar>
-              <w:top w:w="100" w:type="dxa"/>
-              <w:bottom w:w="100" w:type="dxa"/>
-              <w:left w:w="120" w:type="dxa"/>
-              <w:right w:w="120" w:type="dxa"/>
-            </w:tcMar>
-          </w:tcPr>
-          <w:p>
-            <w:pPr>
-              <w:spacing w:after="0"/>
-            </w:pPr>
-            <w:r>
-              <w:rPr>
-                <w:color w:val="1E293B"/>
-                <w:sz w:val="17"/>
-              </w:rPr>
-              <w:t>Entri berada tepat di depan kolam Equal Highs / Equal Lows retail.</w:t>
-            </w:r>
-          </w:p>
-        </w:tc>
-      </w:tr>
-      <w:tr>
-        <w:tc>
-          <w:tcPr>
-            <w:tcW w:type="dxa" w:w="3168"/>
-            <w:shd w:fill="ffffff"/>
-            <w:tcMar>
-              <w:top w:w="100" w:type="dxa"/>
-              <w:bottom w:w="100" w:type="dxa"/>
-              <w:left w:w="120" w:type="dxa"/>
-              <w:right w:w="120" w:type="dxa"/>
-            </w:tcMar>
-          </w:tcPr>
-          <w:p>
-            <w:pPr>
-              <w:spacing w:after="0"/>
-            </w:pPr>
-            <w:r>
-              <w:rPr>
-                <w:color w:val="1E293B"/>
-                <w:sz w:val="17"/>
-              </w:rPr>
-              <w:t>SPREAD_SPIKE</w:t>
-            </w:r>
-          </w:p>
-        </w:tc>
-        <w:tc>
-          <w:tcPr>
-            <w:tcW w:type="dxa" w:w="6480"/>
-            <w:shd w:fill="ffffff"/>
-            <w:tcMar>
-              <w:top w:w="100" w:type="dxa"/>
-              <w:bottom w:w="100" w:type="dxa"/>
-              <w:left w:w="120" w:type="dxa"/>
-              <w:right w:w="120" w:type="dxa"/>
-            </w:tcMar>
-          </w:tcPr>
-          <w:p>
-            <w:pPr>
-              <w:spacing w:after="0"/>
-            </w:pPr>
-            <w:r>
-              <w:rPr>
-                <w:color w:val="1E293B"/>
-                <w:sz w:val="17"/>
-              </w:rPr>
-              <w:t>Spread broker melebar melebihi batas toleransi volatilitas normal.</w:t>
-            </w:r>
-          </w:p>
-        </w:tc>
-      </w:tr>
-      <w:tr>
-        <w:tc>
-          <w:tcPr>
-            <w:tcW w:type="dxa" w:w="3168"/>
-            <w:shd w:fill="f8fafc"/>
-            <w:tcMar>
-              <w:top w:w="100" w:type="dxa"/>
-              <w:bottom w:w="100" w:type="dxa"/>
-              <w:left w:w="120" w:type="dxa"/>
-              <w:right w:w="120" w:type="dxa"/>
-            </w:tcMar>
-          </w:tcPr>
-          <w:p>
-            <w:pPr>
-              <w:spacing w:after="0"/>
-            </w:pPr>
-            <w:r>
-              <w:rPr>
-                <w:color w:val="1E293B"/>
-                <w:sz w:val="17"/>
-              </w:rPr>
-              <w:t>INSTANT_RETEST</w:t>
-            </w:r>
-          </w:p>
-        </w:tc>
-        <w:tc>
-          <w:tcPr>
-            <w:tcW w:type="dxa" w:w="6480"/>
-            <w:shd w:fill="f8fafc"/>
-            <w:tcMar>
-              <w:top w:w="100" w:type="dxa"/>
-              <w:bottom w:w="100" w:type="dxa"/>
-              <w:left w:w="120" w:type="dxa"/>
-              <w:right w:w="120" w:type="dxa"/>
-            </w:tcMar>
-          </w:tcPr>
-          <w:p>
-            <w:pPr>
-              <w:spacing w:after="0"/>
-            </w:pPr>
-            <w:r>
-              <w:rPr>
-                <w:color w:val="1E293B"/>
-                <w:sz w:val="17"/>
-              </w:rPr>
-              <w:t>Retest palsu yang terjadi terlalu cepat (&lt; 2 bar) setelah breakout.</w:t>
-            </w:r>
-          </w:p>
-        </w:tc>
-      </w:tr>
-      <w:tr>
-        <w:tc>
-          <w:tcPr>
-            <w:tcW w:type="dxa" w:w="3168"/>
-            <w:shd w:fill="ffffff"/>
-            <w:tcMar>
-              <w:top w:w="100" w:type="dxa"/>
-              <w:bottom w:w="100" w:type="dxa"/>
-              <w:left w:w="120" w:type="dxa"/>
-              <w:right w:w="120" w:type="dxa"/>
-            </w:tcMar>
-          </w:tcPr>
-          <w:p>
-            <w:pPr>
-              <w:spacing w:after="0"/>
-            </w:pPr>
-            <w:r>
-              <w:rPr>
-                <w:color w:val="1E293B"/>
-                <w:sz w:val="17"/>
-              </w:rPr>
-              <w:t>NEAR_EQH_EQL</w:t>
-            </w:r>
-          </w:p>
-        </w:tc>
-        <w:tc>
-          <w:tcPr>
-            <w:tcW w:type="dxa" w:w="6480"/>
-            <w:shd w:fill="ffffff"/>
-            <w:tcMar>
-              <w:top w:w="100" w:type="dxa"/>
-              <w:bottom w:w="100" w:type="dxa"/>
-              <w:left w:w="120" w:type="dxa"/>
-              <w:right w:w="120" w:type="dxa"/>
-            </w:tcMar>
-          </w:tcPr>
-          <w:p>
-            <w:pPr>
-              <w:spacing w:after="0"/>
-            </w:pPr>
-            <w:r>
-              <w:rPr>
-                <w:color w:val="1E293B"/>
-                <w:sz w:val="17"/>
-              </w:rPr>
-              <w:t>Area target terhalang oleh resistance/support ganda retail yang rawan pembalikan.</w:t>
-            </w:r>
-          </w:p>
-        </w:tc>
-      </w:tr>
-      <w:tr>
-        <w:tc>
-          <w:tcPr>
-            <w:tcW w:type="dxa" w:w="3168"/>
-            <w:shd w:fill="f8fafc"/>
-            <w:tcMar>
-              <w:top w:w="100" w:type="dxa"/>
-              <w:bottom w:w="100" w:type="dxa"/>
-              <w:left w:w="120" w:type="dxa"/>
-              <w:right w:w="120" w:type="dxa"/>
-            </w:tcMar>
-          </w:tcPr>
-          <w:p>
-            <w:pPr>
-              <w:spacing w:after="0"/>
-            </w:pPr>
-            <w:r>
-              <w:rPr>
-                <w:color w:val="1E293B"/>
-                <w:sz w:val="17"/>
-              </w:rPr>
-              <w:t>ROLLOVER_WINDOW</w:t>
-            </w:r>
-          </w:p>
-        </w:tc>
-        <w:tc>
-          <w:tcPr>
-            <w:tcW w:type="dxa" w:w="6480"/>
-            <w:shd w:fill="f8fafc"/>
-            <w:tcMar>
-              <w:top w:w="100" w:type="dxa"/>
-              <w:bottom w:w="100" w:type="dxa"/>
-              <w:left w:w="120" w:type="dxa"/>
-              <w:right w:w="120" w:type="dxa"/>
-            </w:tcMar>
-          </w:tcPr>
-          <w:p>
-            <w:pPr>
-              <w:spacing w:after="0"/>
-            </w:pPr>
-            <w:r>
-              <w:rPr>
-                <w:color w:val="1E293B"/>
-                <w:sz w:val="17"/>
-              </w:rPr>
-              <w:t>Waktu eksekusi memasuki jendela bahaya rollover harian broker (03:50-04:15 WIB).</w:t>
-            </w:r>
-          </w:p>
-        </w:tc>
-      </w:tr>
-      <w:tr>
-        <w:tc>
-          <w:tcPr>
-            <w:tcW w:type="dxa" w:w="3168"/>
-            <w:shd w:fill="ffffff"/>
-            <w:tcMar>
-              <w:top w:w="100" w:type="dxa"/>
-              <w:bottom w:w="100" w:type="dxa"/>
-              <w:left w:w="120" w:type="dxa"/>
-              <w:right w:w="120" w:type="dxa"/>
-            </w:tcMar>
-          </w:tcPr>
-          <w:p>
-            <w:pPr>
-              <w:spacing w:after="0"/>
-            </w:pPr>
-            <w:r>
-              <w:rPr>
-                <w:color w:val="1E293B"/>
-                <w:sz w:val="17"/>
-              </w:rPr>
-              <w:t>NONE</w:t>
-            </w:r>
-          </w:p>
-        </w:tc>
-        <w:tc>
-          <w:tcPr>
-            <w:tcW w:type="dxa" w:w="6480"/>
-            <w:shd w:fill="ffffff"/>
-            <w:tcMar>
-              <w:top w:w="100" w:type="dxa"/>
-              <w:bottom w:w="100" w:type="dxa"/>
-              <w:left w:w="120" w:type="dxa"/>
-              <w:right w:w="120" w:type="dxa"/>
-            </w:tcMar>
-          </w:tcPr>
-          <w:p>
-            <w:pPr>
-              <w:spacing w:after="0"/>
-            </w:pPr>
-            <w:r>
-              <w:rPr>
-                <w:color w:val="1E293B"/>
-                <w:sz w:val="17"/>
-              </w:rPr>
-              <w:t>Kondisi pasar aman total, seluruh kriteria terpenuhi tanpa anomali risiko.</w:t>
-            </w:r>
-          </w:p>
-        </w:tc>
-      </w:tr>
-    </w:tbl>
-    <w:p>
-      <w:pPr>
-        <w:spacing w:after="120"/>
-      </w:pPr>
-    </w:p>
-    <w:p>
-      <w:r>
-        <w:t>Unanimous 3/3 High Confidence Split (+25% Boost):</w:t>
-      </w:r>
-    </w:p>
-    <w:p>
-      <w:r>
-        <w:t>Jika ketiga model (OpenAI, Gemini, DeepSeek) sepakat bulat searah dengan Confidence &gt;= 75% dan terdapat &gt;= 2 slot MT5 terbuka, sistem mengeksekusi 2 tiket posisi masing-masing berukuran 0.625x Base Lot (Total 1.25x bobot):</w:t>
-        <w:br/>
-        <w:t>• Posisi #1: Menargetkan TP1 Standar (Stasiun terdekat) dengan trailing stop agresif.</w:t>
-        <w:br/>
-        <w:t>• Posisi #2: Menargetkan TP2 Extended Target (Stasiun makro besar) dengan trailing swing bernafas.</w:t>
-      </w:r>
-    </w:p>
-    <w:p>
-      <w:pPr>
-        <w:pStyle w:val="Heading1"/>
-        <w:keepNext/>
-        <w:spacing w:before="360" w:after="120"/>
-      </w:pPr>
-      <w:r>
-        <w:rPr>
-          <w:b/>
-          <w:color w:val="0F172A"/>
-          <w:sz w:val="30"/>
-        </w:rPr>
-        <w:t>Bab 9: Risk Engine &amp; Mathematical Account Safeguards (risk_engine.py)</w:t>
-      </w:r>
-    </w:p>
-    <w:p>
-      <w:r>
-        <w:t>Sistem menerapkan manajemen risiko fraksional berbobot matematis:</w:t>
-      </w:r>
-    </w:p>
-    <w:tbl>
-      <w:tblPr>
-        <w:tblW w:type="auto" w:w="0"/>
-        <w:jc w:val="center"/>
-        <w:tblLayout w:type="fixed"/>
-        <w:tblLook w:firstColumn="1" w:firstRow="1" w:lastColumn="0" w:lastRow="0" w:noHBand="0" w:noVBand="1" w:val="04A0"/>
-      </w:tblPr>
-      <w:tblGrid>
-        <w:gridCol w:w="9648"/>
-      </w:tblGrid>
-      <w:tr>
-        <w:tc>
-          <w:tcPr>
-            <w:tcW w:type="dxa" w:w="9936"/>
-            <w:shd w:fill="0f172a"/>
-            <w:tcMar>
-              <w:top w:w="140" w:type="dxa"/>
-              <w:bottom w:w="140" w:type="dxa"/>
-              <w:left w:w="180" w:type="dxa"/>
-              <w:right w:w="180" w:type="dxa"/>
-            </w:tcMar>
-          </w:tcPr>
-          <w:p>
-            <w:pPr>
-              <w:spacing w:after="0" w:line="276" w:lineRule="auto"/>
-            </w:pPr>
-            <w:r>
-              <w:rPr>
-                <w:rFonts w:ascii="Consolas" w:hAnsi="Consolas"/>
-                <w:color w:val="E2E8F0"/>
-                <w:sz w:val="17"/>
-              </w:rPr>
-              <w:t>// Rumus Dinamis Ukuran Lot Berbasis Risiko</w:t>
-              <w:br/>
-              <w:t>Lot_Size = (Account_Equity * Risk_Percent) / (SL_Points * USD_Per_Point)</w:t>
-              <w:br/>
-              <w:br/>
-              <w:t>// Contoh Kasus Riil pada Akun $5,818 (Risk 1.0% = $58.18):</w:t>
-              <w:br/>
-              <w:t>// GBPUSD SL 130 pts (13 pips) -&gt; Lot = $58.18 / (130 * $1.00) = 0.44 Lot</w:t>
-              <w:br/>
-              <w:t>// XAUUSD SL 450 pts ($4.50)   -&gt; Lot = $58.18 / (450 * $1.00) = 0.12 Lot</w:t>
-            </w:r>
-          </w:p>
-        </w:tc>
-      </w:tr>
-    </w:tbl>
-    <w:p>
-      <w:pPr>
-        <w:spacing w:before="0" w:after="80"/>
-      </w:pPr>
-    </w:p>
-    <w:p>
-      <w:r>
-        <w:t>Aturan Batasan Portofolio &amp; Proteksi Akun:</w:t>
-        <w:br/>
-        <w:t>1. Floor SL: Emas SL &gt;= max(2x spread, 1.8x ATR M30); Forex SL &gt;= max(2x spread, 1.3x ATR H1).</w:t>
-        <w:br/>
-        <w:t>2. Ceiling SL: Forex SL dibatasi maksimal &lt;= 160 pts (16 pips) untuk mencegah pelebaran risiko.</w:t>
-        <w:br/>
-        <w:t>3. Max Daily Loss Limit: 4.0% Equity (Cut trading otomatis jika rugi harian menyentuh 4%).</w:t>
-        <w:br/>
-        <w:t>4. Daily Profit Target: 6.0% Equity (Kunci profit harian untuk mencegah overtrading).</w:t>
-        <w:br/>
-        <w:t>5. Aggregate Position Cap: Maksimal 6 posisi terbuka + 4 pending limit order (shared pool).</w:t>
-        <w:br/>
-        <w:t>6. Recovery Mode: Terpicu jika terjadi 5 loss beruntun -&gt; Lot dipangkas x0.5 dan max posisi dibatasi 3.</w:t>
-      </w:r>
-    </w:p>
-    <w:p>
-      <w:pPr>
-        <w:pStyle w:val="Heading1"/>
-        <w:keepNext/>
-        <w:spacing w:before="360" w:after="120"/>
-      </w:pPr>
-      <w:r>
-        <w:rPr>
-          <w:b/>
-          <w:color w:val="0F172A"/>
-          <w:sz w:val="30"/>
-        </w:rPr>
-        <w:t>Bab 10: Real-Time Position Management Lifecycle (position_manager.py)</w:t>
-      </w:r>
-    </w:p>
-    <w:p>
-      <w:r>
-        <w:t>Setiap posisi terbuka dipantau secara deterministik setiap 3 detik:</w:t>
-      </w:r>
-    </w:p>
-    <w:p>
-      <w:r>
-        <w:t>1. Pocket Profit Break-Even (BEP): Terpicu di 45%–55% TP. SL digeser ke Entry + Komisi Round-Trip + Pocket Profit 15 pts (1.5 pips).</w:t>
-        <w:br/>
-        <w:t>2. Partial Close 50% (TP1): Mencairkan 50% lot di 45%–55% TP untuk mengamankan kas di muka dan menjadikan sisa posisi bebas risiko (Risk-Free Runner).</w:t>
-        <w:br/>
-        <w:t>3. 2-Stage Dynamic Trailing Stop:</w:t>
-        <w:br/>
-        <w:t xml:space="preserve">   • Stage 1 (Swing Breathing: 65% s/d &lt;90% TP): Jarak trailing 0.75x ATR H1 (Floor 80 pts FX).</w:t>
-        <w:br/>
-        <w:t xml:space="preserve">   • Stage 2 (Terminal Lock: &gt;= 90% TP): Mengunci profit ketat dengan jarak 0.50x ATR M30 (Floor 30 pts FX).</w:t>
-        <w:br/>
-        <w:t>4. Peak-Aware Time-Decay Stagnation Exit: Posisi yang terbuka &gt;= 4 jam di rentang [-0.20R, +0.20R] ditutup otomatis jika Peak MFE &lt; +0.30R.</w:t>
-        <w:br/>
-        <w:t>5. Pre-Rollover Shield (03:50 – 04:15 WIB): Menutup otomatis posisi yang berjarak fisik dekat SL pada jam 03:50 WIB sebelum lonjakan spread rollover 04:00 WIB.</w:t>
-      </w:r>
-    </w:p>
-    <w:p>
-      <w:pPr>
-        <w:pStyle w:val="Heading1"/>
-        <w:keepNext/>
-        <w:spacing w:before="360" w:after="120"/>
-      </w:pPr>
-      <w:r>
-        <w:rPr>
-          <w:b/>
-          <w:color w:val="0F172A"/>
-          <w:sz w:val="30"/>
-        </w:rPr>
-        <w:t>Bab 11: Comprehensive Tokenomics, Latency &amp; Cost Optimization</w:t>
-      </w:r>
-    </w:p>
-    <w:p>
-      <w:r>
-        <w:t>Analisis komparatif kuantitatif konsumsi token dan biaya operasional API:</w:t>
-      </w:r>
-    </w:p>
-    <w:tbl>
-      <w:tblPr>
-        <w:tblW w:type="auto" w:w="0"/>
-        <w:jc w:val="center"/>
-        <w:tblLayout w:type="fixed"/>
-        <w:tblLook w:firstColumn="1" w:firstRow="1" w:lastColumn="0" w:lastRow="0" w:noHBand="0" w:noVBand="1" w:val="04A0"/>
-      </w:tblPr>
-      <w:tblGrid>
-        <w:gridCol w:w="2484"/>
-        <w:gridCol w:w="2484"/>
-        <w:gridCol w:w="2484"/>
-        <w:gridCol w:w="2484"/>
-      </w:tblGrid>
-      <w:tr>
-        <w:tc>
-          <w:tcPr>
-            <w:tcW w:type="dxa" w:w="2880"/>
-            <w:shd w:fill="0f172a"/>
-            <w:tcMar>
-              <w:top w:w="120" w:type="dxa"/>
-              <w:bottom w:w="120" w:type="dxa"/>
-              <w:left w:w="120" w:type="dxa"/>
-              <w:right w:w="120" w:type="dxa"/>
-            </w:tcMar>
-          </w:tcPr>
-          <w:p>
-            <w:pPr>
-              <w:spacing w:after="0"/>
-            </w:pPr>
-            <w:r>
-              <w:rPr>
-                <w:b/>
-                <w:color w:val="FFFFFF"/>
-                <w:sz w:val="18"/>
-              </w:rPr>
-              <w:t>Komponen Arsitektur</w:t>
-            </w:r>
-          </w:p>
-        </w:tc>
-        <w:tc>
-          <w:tcPr>
-            <w:tcW w:type="dxa" w:w="2160"/>
-            <w:shd w:fill="0f172a"/>
-            <w:tcMar>
-              <w:top w:w="120" w:type="dxa"/>
-              <w:bottom w:w="120" w:type="dxa"/>
-              <w:left w:w="120" w:type="dxa"/>
-              <w:right w:w="120" w:type="dxa"/>
-            </w:tcMar>
-          </w:tcPr>
-          <w:p>
-            <w:pPr>
-              <w:spacing w:after="0"/>
-            </w:pPr>
-            <w:r>
-              <w:rPr>
-                <w:b/>
-                <w:color w:val="FFFFFF"/>
-                <w:sz w:val="18"/>
-              </w:rPr>
-              <w:t>Metode Polling Lama (M5)</w:t>
-            </w:r>
-          </w:p>
-        </w:tc>
-        <w:tc>
-          <w:tcPr>
-            <w:tcW w:type="dxa" w:w="2304"/>
-            <w:shd w:fill="0f172a"/>
-            <w:tcMar>
-              <w:top w:w="120" w:type="dxa"/>
-              <w:bottom w:w="120" w:type="dxa"/>
-              <w:left w:w="120" w:type="dxa"/>
-              <w:right w:w="120" w:type="dxa"/>
-            </w:tcMar>
-          </w:tcPr>
-          <w:p>
-            <w:pPr>
-              <w:spacing w:after="0"/>
-            </w:pPr>
-            <w:r>
-              <w:rPr>
-                <w:b/>
-                <w:color w:val="FFFFFF"/>
-                <w:sz w:val="18"/>
-              </w:rPr>
-              <w:t>2-Stage Quant Funnel (Baru)</w:t>
-            </w:r>
-          </w:p>
-        </w:tc>
-        <w:tc>
-          <w:tcPr>
-            <w:tcW w:type="dxa" w:w="2304"/>
-            <w:shd w:fill="0f172a"/>
-            <w:tcMar>
-              <w:top w:w="120" w:type="dxa"/>
-              <w:bottom w:w="120" w:type="dxa"/>
-              <w:left w:w="120" w:type="dxa"/>
-              <w:right w:w="120" w:type="dxa"/>
-            </w:tcMar>
-          </w:tcPr>
-          <w:p>
-            <w:pPr>
-              <w:spacing w:after="0"/>
-            </w:pPr>
-            <w:r>
-              <w:rPr>
-                <w:b/>
-                <w:color w:val="FFFFFF"/>
-                <w:sz w:val="18"/>
-              </w:rPr>
-              <w:t>Efisiensi Penghematan</w:t>
-            </w:r>
-          </w:p>
-        </w:tc>
-      </w:tr>
-      <w:tr>
-        <w:tc>
-          <w:tcPr>
-            <w:tcW w:type="dxa" w:w="2880"/>
-            <w:shd w:fill="ffffff"/>
-            <w:tcMar>
-              <w:top w:w="100" w:type="dxa"/>
-              <w:bottom w:w="100" w:type="dxa"/>
-              <w:left w:w="120" w:type="dxa"/>
-              <w:right w:w="120" w:type="dxa"/>
-            </w:tcMar>
-          </w:tcPr>
-          <w:p>
-            <w:pPr>
-              <w:spacing w:after="0"/>
-            </w:pPr>
-            <w:r>
-              <w:rPr>
-                <w:color w:val="1E293B"/>
-                <w:sz w:val="17"/>
-              </w:rPr>
-              <w:t>Frekuensi Pemindaian</w:t>
-            </w:r>
-          </w:p>
-        </w:tc>
-        <w:tc>
-          <w:tcPr>
-            <w:tcW w:type="dxa" w:w="2160"/>
-            <w:shd w:fill="ffffff"/>
-            <w:tcMar>
-              <w:top w:w="100" w:type="dxa"/>
-              <w:bottom w:w="100" w:type="dxa"/>
-              <w:left w:w="120" w:type="dxa"/>
-              <w:right w:w="120" w:type="dxa"/>
-            </w:tcMar>
-          </w:tcPr>
-          <w:p>
-            <w:pPr>
-              <w:spacing w:after="0"/>
-            </w:pPr>
-            <w:r>
-              <w:rPr>
-                <w:color w:val="1E293B"/>
-                <w:sz w:val="17"/>
-              </w:rPr>
-              <w:t>7.776 Siklus / Hari</w:t>
-            </w:r>
-          </w:p>
-        </w:tc>
-        <w:tc>
-          <w:tcPr>
-            <w:tcW w:type="dxa" w:w="2304"/>
-            <w:shd w:fill="ffffff"/>
-            <w:tcMar>
-              <w:top w:w="100" w:type="dxa"/>
-              <w:bottom w:w="100" w:type="dxa"/>
-              <w:left w:w="120" w:type="dxa"/>
-              <w:right w:w="120" w:type="dxa"/>
-            </w:tcMar>
-          </w:tcPr>
-          <w:p>
-            <w:pPr>
-              <w:spacing w:after="0"/>
-            </w:pPr>
-            <w:r>
-              <w:rPr>
-                <w:color w:val="1E293B"/>
-                <w:sz w:val="17"/>
-              </w:rPr>
-              <w:t>1.440 Siklus Radar / Hari</w:t>
-            </w:r>
-          </w:p>
-        </w:tc>
-        <w:tc>
-          <w:tcPr>
-            <w:tcW w:type="dxa" w:w="2304"/>
-            <w:shd w:fill="ffffff"/>
-            <w:tcMar>
-              <w:top w:w="100" w:type="dxa"/>
-              <w:bottom w:w="100" w:type="dxa"/>
-              <w:left w:w="120" w:type="dxa"/>
-              <w:right w:w="120" w:type="dxa"/>
-            </w:tcMar>
-          </w:tcPr>
-          <w:p>
-            <w:pPr>
-              <w:spacing w:after="0"/>
-            </w:pPr>
-            <w:r>
-              <w:rPr>
-                <w:color w:val="1E293B"/>
-                <w:sz w:val="17"/>
-              </w:rPr>
-              <w:t>Lokal di MT5 (0 Token)</w:t>
-            </w:r>
-          </w:p>
-        </w:tc>
-      </w:tr>
-      <w:tr>
-        <w:tc>
-          <w:tcPr>
-            <w:tcW w:type="dxa" w:w="2880"/>
-            <w:shd w:fill="f8fafc"/>
-            <w:tcMar>
-              <w:top w:w="100" w:type="dxa"/>
-              <w:bottom w:w="100" w:type="dxa"/>
-              <w:left w:w="120" w:type="dxa"/>
-              <w:right w:w="120" w:type="dxa"/>
-            </w:tcMar>
-          </w:tcPr>
-          <w:p>
-            <w:pPr>
-              <w:spacing w:after="0"/>
-            </w:pPr>
-            <w:r>
-              <w:rPr>
-                <w:color w:val="1E293B"/>
-                <w:sz w:val="17"/>
-              </w:rPr>
-              <w:t>Panggilan API per Hari</w:t>
-            </w:r>
-          </w:p>
-        </w:tc>
-        <w:tc>
-          <w:tcPr>
-            <w:tcW w:type="dxa" w:w="2160"/>
-            <w:shd w:fill="f8fafc"/>
-            <w:tcMar>
-              <w:top w:w="100" w:type="dxa"/>
-              <w:bottom w:w="100" w:type="dxa"/>
-              <w:left w:w="120" w:type="dxa"/>
-              <w:right w:w="120" w:type="dxa"/>
-            </w:tcMar>
-          </w:tcPr>
-          <w:p>
-            <w:pPr>
-              <w:spacing w:after="0"/>
-            </w:pPr>
-            <w:r>
-              <w:rPr>
-                <w:color w:val="1E293B"/>
-                <w:sz w:val="17"/>
-              </w:rPr>
-              <w:t>23.328 API Calls / Hari</w:t>
-            </w:r>
-          </w:p>
-        </w:tc>
-        <w:tc>
-          <w:tcPr>
-            <w:tcW w:type="dxa" w:w="2304"/>
-            <w:shd w:fill="f8fafc"/>
-            <w:tcMar>
-              <w:top w:w="100" w:type="dxa"/>
-              <w:bottom w:w="100" w:type="dxa"/>
-              <w:left w:w="120" w:type="dxa"/>
-              <w:right w:w="120" w:type="dxa"/>
-            </w:tcMar>
-          </w:tcPr>
-          <w:p>
-            <w:pPr>
-              <w:spacing w:after="0"/>
-            </w:pPr>
-            <w:r>
-              <w:rPr>
-                <w:color w:val="1E293B"/>
-                <w:sz w:val="17"/>
-              </w:rPr>
-              <w:t>75 - 135 API Calls / Hari</w:t>
-            </w:r>
-          </w:p>
-        </w:tc>
-        <w:tc>
-          <w:tcPr>
-            <w:tcW w:type="dxa" w:w="2304"/>
-            <w:shd w:fill="f8fafc"/>
-            <w:tcMar>
-              <w:top w:w="100" w:type="dxa"/>
-              <w:bottom w:w="100" w:type="dxa"/>
-              <w:left w:w="120" w:type="dxa"/>
-              <w:right w:w="120" w:type="dxa"/>
-            </w:tcMar>
-          </w:tcPr>
-          <w:p>
-            <w:pPr>
-              <w:spacing w:after="0"/>
-            </w:pPr>
-            <w:r>
-              <w:rPr>
-                <w:color w:val="1E293B"/>
-                <w:sz w:val="17"/>
-              </w:rPr>
-              <w:t>Pangkas 99.4% Calls</w:t>
-            </w:r>
-          </w:p>
-        </w:tc>
-      </w:tr>
-      <w:tr>
-        <w:tc>
-          <w:tcPr>
-            <w:tcW w:type="dxa" w:w="2880"/>
-            <w:shd w:fill="ffffff"/>
-            <w:tcMar>
-              <w:top w:w="100" w:type="dxa"/>
-              <w:bottom w:w="100" w:type="dxa"/>
-              <w:left w:w="120" w:type="dxa"/>
-              <w:right w:w="120" w:type="dxa"/>
-            </w:tcMar>
-          </w:tcPr>
-          <w:p>
-            <w:pPr>
-              <w:spacing w:after="0"/>
-            </w:pPr>
-            <w:r>
-              <w:rPr>
-                <w:color w:val="1E293B"/>
-                <w:sz w:val="17"/>
-              </w:rPr>
-              <w:t>Konsumsi Token Harian</w:t>
-            </w:r>
-          </w:p>
-        </w:tc>
-        <w:tc>
-          <w:tcPr>
-            <w:tcW w:type="dxa" w:w="2160"/>
-            <w:shd w:fill="ffffff"/>
-            <w:tcMar>
-              <w:top w:w="100" w:type="dxa"/>
-              <w:bottom w:w="100" w:type="dxa"/>
-              <w:left w:w="120" w:type="dxa"/>
-              <w:right w:w="120" w:type="dxa"/>
-            </w:tcMar>
-          </w:tcPr>
-          <w:p>
-            <w:pPr>
-              <w:spacing w:after="0"/>
-            </w:pPr>
-            <w:r>
-              <w:rPr>
-                <w:color w:val="1E293B"/>
-                <w:sz w:val="17"/>
-              </w:rPr>
-              <w:t>~35.000.000 Token / Hari</w:t>
-            </w:r>
-          </w:p>
-        </w:tc>
-        <w:tc>
-          <w:tcPr>
-            <w:tcW w:type="dxa" w:w="2304"/>
-            <w:shd w:fill="ffffff"/>
-            <w:tcMar>
-              <w:top w:w="100" w:type="dxa"/>
-              <w:bottom w:w="100" w:type="dxa"/>
-              <w:left w:w="120" w:type="dxa"/>
-              <w:right w:w="120" w:type="dxa"/>
-            </w:tcMar>
-          </w:tcPr>
-          <w:p>
-            <w:pPr>
-              <w:spacing w:after="0"/>
-            </w:pPr>
-            <w:r>
-              <w:rPr>
-                <w:color w:val="1E293B"/>
-                <w:sz w:val="17"/>
-              </w:rPr>
-              <w:t>~150.000 Token / Hari</w:t>
-            </w:r>
-          </w:p>
-        </w:tc>
-        <w:tc>
-          <w:tcPr>
-            <w:tcW w:type="dxa" w:w="2304"/>
-            <w:shd w:fill="ffffff"/>
-            <w:tcMar>
-              <w:top w:w="100" w:type="dxa"/>
-              <w:bottom w:w="100" w:type="dxa"/>
-              <w:left w:w="120" w:type="dxa"/>
-              <w:right w:w="120" w:type="dxa"/>
-            </w:tcMar>
-          </w:tcPr>
-          <w:p>
-            <w:pPr>
-              <w:spacing w:after="0"/>
-            </w:pPr>
-            <w:r>
-              <w:rPr>
-                <w:color w:val="1E293B"/>
-                <w:sz w:val="17"/>
-              </w:rPr>
-              <w:t>Hemat 99.5% Token</w:t>
-            </w:r>
-          </w:p>
-        </w:tc>
-      </w:tr>
-      <w:tr>
-        <w:tc>
-          <w:tcPr>
-            <w:tcW w:type="dxa" w:w="2880"/>
-            <w:shd w:fill="f8fafc"/>
-            <w:tcMar>
-              <w:top w:w="100" w:type="dxa"/>
-              <w:bottom w:w="100" w:type="dxa"/>
-              <w:left w:w="120" w:type="dxa"/>
-              <w:right w:w="120" w:type="dxa"/>
-            </w:tcMar>
-          </w:tcPr>
-          <w:p>
-            <w:pPr>
-              <w:spacing w:after="0"/>
-            </w:pPr>
-            <w:r>
-              <w:rPr>
-                <w:color w:val="1E293B"/>
-                <w:sz w:val="17"/>
-              </w:rPr>
-              <w:t>Estimasi Biaya API Harian</w:t>
-            </w:r>
-          </w:p>
-        </w:tc>
-        <w:tc>
-          <w:tcPr>
-            <w:tcW w:type="dxa" w:w="2160"/>
-            <w:shd w:fill="f8fafc"/>
-            <w:tcMar>
-              <w:top w:w="100" w:type="dxa"/>
-              <w:bottom w:w="100" w:type="dxa"/>
-              <w:left w:w="120" w:type="dxa"/>
-              <w:right w:w="120" w:type="dxa"/>
-            </w:tcMar>
-          </w:tcPr>
-          <w:p>
-            <w:pPr>
-              <w:spacing w:after="0"/>
-            </w:pPr>
-            <w:r>
-              <w:rPr>
-                <w:color w:val="1E293B"/>
-                <w:sz w:val="17"/>
-              </w:rPr>
-              <w:t>$15.00 - $35.00 / Hari</w:t>
-            </w:r>
-          </w:p>
-        </w:tc>
-        <w:tc>
-          <w:tcPr>
-            <w:tcW w:type="dxa" w:w="2304"/>
-            <w:shd w:fill="f8fafc"/>
-            <w:tcMar>
-              <w:top w:w="100" w:type="dxa"/>
-              <w:bottom w:w="100" w:type="dxa"/>
-              <w:left w:w="120" w:type="dxa"/>
-              <w:right w:w="120" w:type="dxa"/>
-            </w:tcMar>
-          </w:tcPr>
-          <w:p>
-            <w:pPr>
-              <w:spacing w:after="0"/>
-            </w:pPr>
-            <w:r>
-              <w:rPr>
-                <w:color w:val="1E293B"/>
-                <w:sz w:val="17"/>
-              </w:rPr>
-              <w:t>$0.10 - $0.25 / Hari</w:t>
-            </w:r>
-          </w:p>
-        </w:tc>
-        <w:tc>
-          <w:tcPr>
-            <w:tcW w:type="dxa" w:w="2304"/>
-            <w:shd w:fill="f8fafc"/>
-            <w:tcMar>
-              <w:top w:w="100" w:type="dxa"/>
-              <w:bottom w:w="100" w:type="dxa"/>
-              <w:left w:w="120" w:type="dxa"/>
-              <w:right w:w="120" w:type="dxa"/>
-            </w:tcMar>
-          </w:tcPr>
-          <w:p>
-            <w:pPr>
-              <w:spacing w:after="0"/>
-            </w:pPr>
-            <w:r>
-              <w:rPr>
-                <w:color w:val="1E293B"/>
-                <w:sz w:val="17"/>
-              </w:rPr>
-              <w:t>Hemat Biaya ~99%</w:t>
-            </w:r>
-          </w:p>
-        </w:tc>
-      </w:tr>
-      <w:tr>
-        <w:tc>
-          <w:tcPr>
-            <w:tcW w:type="dxa" w:w="2880"/>
-            <w:shd w:fill="ffffff"/>
-            <w:tcMar>
-              <w:top w:w="100" w:type="dxa"/>
-              <w:bottom w:w="100" w:type="dxa"/>
-              <w:left w:w="120" w:type="dxa"/>
-              <w:right w:w="120" w:type="dxa"/>
-            </w:tcMar>
-          </w:tcPr>
-          <w:p>
-            <w:pPr>
-              <w:spacing w:after="0"/>
-            </w:pPr>
-            <w:r>
-              <w:rPr>
-                <w:color w:val="1E293B"/>
-                <w:sz w:val="17"/>
-              </w:rPr>
-              <w:t>Estimasi Biaya Bulanan</w:t>
-            </w:r>
-          </w:p>
-        </w:tc>
-        <w:tc>
-          <w:tcPr>
-            <w:tcW w:type="dxa" w:w="2160"/>
-            <w:shd w:fill="ffffff"/>
-            <w:tcMar>
-              <w:top w:w="100" w:type="dxa"/>
-              <w:bottom w:w="100" w:type="dxa"/>
-              <w:left w:w="120" w:type="dxa"/>
-              <w:right w:w="120" w:type="dxa"/>
-            </w:tcMar>
-          </w:tcPr>
-          <w:p>
-            <w:pPr>
-              <w:spacing w:after="0"/>
-            </w:pPr>
-            <w:r>
-              <w:rPr>
-                <w:color w:val="1E293B"/>
-                <w:sz w:val="17"/>
-              </w:rPr>
-              <w:t>$450 - $1.000 / Bulan</w:t>
-            </w:r>
-          </w:p>
-        </w:tc>
-        <w:tc>
-          <w:tcPr>
-            <w:tcW w:type="dxa" w:w="2304"/>
-            <w:shd w:fill="ffffff"/>
-            <w:tcMar>
-              <w:top w:w="100" w:type="dxa"/>
-              <w:bottom w:w="100" w:type="dxa"/>
-              <w:left w:w="120" w:type="dxa"/>
-              <w:right w:w="120" w:type="dxa"/>
-            </w:tcMar>
-          </w:tcPr>
-          <w:p>
-            <w:pPr>
-              <w:spacing w:after="0"/>
-            </w:pPr>
-            <w:r>
-              <w:rPr>
-                <w:color w:val="1E293B"/>
-                <w:sz w:val="17"/>
-              </w:rPr>
-              <w:t>$3.00 - $7.50 / Bulan</w:t>
-            </w:r>
-          </w:p>
-        </w:tc>
-        <w:tc>
-          <w:tcPr>
-            <w:tcW w:type="dxa" w:w="2304"/>
-            <w:shd w:fill="ffffff"/>
-            <w:tcMar>
-              <w:top w:w="100" w:type="dxa"/>
-              <w:bottom w:w="100" w:type="dxa"/>
-              <w:left w:w="120" w:type="dxa"/>
-              <w:right w:w="120" w:type="dxa"/>
-            </w:tcMar>
-          </w:tcPr>
-          <w:p>
-            <w:pPr>
-              <w:spacing w:after="0"/>
-            </w:pPr>
-            <w:r>
-              <w:rPr>
-                <w:color w:val="1E293B"/>
-                <w:sz w:val="17"/>
-              </w:rPr>
-              <w:t>Hemat $440+/Bulan</w:t>
-            </w:r>
-          </w:p>
-        </w:tc>
-      </w:tr>
-      <w:tr>
-        <w:tc>
-          <w:tcPr>
-            <w:tcW w:type="dxa" w:w="2880"/>
-            <w:shd w:fill="f8fafc"/>
-            <w:tcMar>
-              <w:top w:w="100" w:type="dxa"/>
-              <w:bottom w:w="100" w:type="dxa"/>
-              <w:left w:w="120" w:type="dxa"/>
-              <w:right w:w="120" w:type="dxa"/>
-            </w:tcMar>
-          </w:tcPr>
-          <w:p>
-            <w:pPr>
-              <w:spacing w:after="0"/>
-            </w:pPr>
-            <w:r>
-              <w:rPr>
-                <w:color w:val="1E293B"/>
-                <w:sz w:val="17"/>
-              </w:rPr>
-              <w:t>Risiko Error 429 Rate Limit</w:t>
-            </w:r>
-          </w:p>
-        </w:tc>
-        <w:tc>
-          <w:tcPr>
-            <w:tcW w:type="dxa" w:w="2160"/>
-            <w:shd w:fill="f8fafc"/>
-            <w:tcMar>
-              <w:top w:w="100" w:type="dxa"/>
-              <w:bottom w:w="100" w:type="dxa"/>
-              <w:left w:w="120" w:type="dxa"/>
-              <w:right w:w="120" w:type="dxa"/>
-            </w:tcMar>
-          </w:tcPr>
-          <w:p>
-            <w:pPr>
-              <w:spacing w:after="0"/>
-            </w:pPr>
-            <w:r>
-              <w:rPr>
-                <w:color w:val="1E293B"/>
-                <w:sz w:val="17"/>
-              </w:rPr>
-              <w:t>Sangat Tinggi (Sering Crash)</w:t>
-            </w:r>
-          </w:p>
-        </w:tc>
-        <w:tc>
-          <w:tcPr>
-            <w:tcW w:type="dxa" w:w="2304"/>
-            <w:shd w:fill="f8fafc"/>
-            <w:tcMar>
-              <w:top w:w="100" w:type="dxa"/>
-              <w:bottom w:w="100" w:type="dxa"/>
-              <w:left w:w="120" w:type="dxa"/>
-              <w:right w:w="120" w:type="dxa"/>
-            </w:tcMar>
-          </w:tcPr>
-          <w:p>
-            <w:pPr>
-              <w:spacing w:after="0"/>
-            </w:pPr>
-            <w:r>
-              <w:rPr>
-                <w:color w:val="1E293B"/>
-                <w:sz w:val="17"/>
-              </w:rPr>
-              <w:t>Nol Mutlak (Bebas Throttle)</w:t>
-            </w:r>
-          </w:p>
-        </w:tc>
-        <w:tc>
-          <w:tcPr>
-            <w:tcW w:type="dxa" w:w="2304"/>
-            <w:shd w:fill="f8fafc"/>
-            <w:tcMar>
-              <w:top w:w="100" w:type="dxa"/>
-              <w:bottom w:w="100" w:type="dxa"/>
-              <w:left w:w="120" w:type="dxa"/>
-              <w:right w:w="120" w:type="dxa"/>
-            </w:tcMar>
-          </w:tcPr>
-          <w:p>
-            <w:pPr>
-              <w:spacing w:after="0"/>
-            </w:pPr>
-            <w:r>
-              <w:rPr>
-                <w:color w:val="1E293B"/>
-                <w:sz w:val="17"/>
-              </w:rPr>
-              <w:t>Reliabilitas 100%</w:t>
-            </w:r>
-          </w:p>
-        </w:tc>
-      </w:tr>
-    </w:tbl>
-    <w:p>
-      <w:pPr>
-        <w:spacing w:after="120"/>
-      </w:pPr>
-    </w:p>
-    <w:p>
-      <w:pPr>
-        <w:pStyle w:val="Heading1"/>
-        <w:keepNext/>
-        <w:spacing w:before="360" w:after="120"/>
-      </w:pPr>
-      <w:r>
-        <w:rPr>
-          <w:b/>
-          <w:color w:val="0F172A"/>
-          <w:sz w:val="30"/>
-        </w:rPr>
-        <w:t>Bab 12: Telegram Interactive Controller &amp; Operational Playbook</w:t>
-      </w:r>
-    </w:p>
-    <w:p>
-      <w:r>
-        <w:t>Sistem dilengkapi antarmuka interaktif 2 arah melalui Telegram Bot dengan mode Fast POST polling:</w:t>
-      </w:r>
-    </w:p>
-    <w:tbl>
-      <w:tblPr>
-        <w:tblW w:type="auto" w:w="0"/>
-        <w:jc w:val="center"/>
-        <w:tblLayout w:type="fixed"/>
-        <w:tblLook w:firstColumn="1" w:firstRow="1" w:lastColumn="0" w:lastRow="0" w:noHBand="0" w:noVBand="1" w:val="04A0"/>
-      </w:tblPr>
-      <w:tblGrid>
-        <w:gridCol w:w="3312"/>
-        <w:gridCol w:w="3312"/>
-        <w:gridCol w:w="3312"/>
-      </w:tblGrid>
-      <w:tr>
-        <w:tc>
-          <w:tcPr>
-            <w:tcW w:type="dxa" w:w="2160"/>
-            <w:shd w:fill="0f172a"/>
-            <w:tcMar>
-              <w:top w:w="120" w:type="dxa"/>
-              <w:bottom w:w="120" w:type="dxa"/>
-              <w:left w:w="120" w:type="dxa"/>
-              <w:right w:w="120" w:type="dxa"/>
-            </w:tcMar>
-          </w:tcPr>
-          <w:p>
-            <w:pPr>
-              <w:spacing w:after="0"/>
-            </w:pPr>
-            <w:r>
-              <w:rPr>
-                <w:b/>
-                <w:color w:val="FFFFFF"/>
-                <w:sz w:val="18"/>
-              </w:rPr>
-              <w:t>Command Telegram</w:t>
-            </w:r>
-          </w:p>
-        </w:tc>
-        <w:tc>
-          <w:tcPr>
-            <w:tcW w:type="dxa" w:w="2880"/>
-            <w:shd w:fill="0f172a"/>
-            <w:tcMar>
-              <w:top w:w="120" w:type="dxa"/>
-              <w:bottom w:w="120" w:type="dxa"/>
-              <w:left w:w="120" w:type="dxa"/>
-              <w:right w:w="120" w:type="dxa"/>
-            </w:tcMar>
-          </w:tcPr>
-          <w:p>
-            <w:pPr>
-              <w:spacing w:after="0"/>
-            </w:pPr>
-            <w:r>
-              <w:rPr>
-                <w:b/>
-                <w:color w:val="FFFFFF"/>
-                <w:sz w:val="18"/>
-              </w:rPr>
-              <w:t>Fungsi &amp; Output</w:t>
-            </w:r>
-          </w:p>
-        </w:tc>
-        <w:tc>
-          <w:tcPr>
-            <w:tcW w:type="dxa" w:w="4608"/>
-            <w:shd w:fill="0f172a"/>
-            <w:tcMar>
-              <w:top w:w="120" w:type="dxa"/>
-              <w:bottom w:w="120" w:type="dxa"/>
-              <w:left w:w="120" w:type="dxa"/>
-              <w:right w:w="120" w:type="dxa"/>
-            </w:tcMar>
-          </w:tcPr>
-          <w:p>
-            <w:pPr>
-              <w:spacing w:after="0"/>
-            </w:pPr>
-            <w:r>
-              <w:rPr>
-                <w:b/>
-                <w:color w:val="FFFFFF"/>
-                <w:sz w:val="18"/>
-              </w:rPr>
-              <w:t>Deskripsi Operasional</w:t>
-            </w:r>
-          </w:p>
-        </w:tc>
-      </w:tr>
-      <w:tr>
-        <w:tc>
-          <w:tcPr>
-            <w:tcW w:type="dxa" w:w="2160"/>
-            <w:shd w:fill="ffffff"/>
-            <w:tcMar>
-              <w:top w:w="100" w:type="dxa"/>
-              <w:bottom w:w="100" w:type="dxa"/>
-              <w:left w:w="120" w:type="dxa"/>
-              <w:right w:w="120" w:type="dxa"/>
-            </w:tcMar>
-          </w:tcPr>
-          <w:p>
-            <w:pPr>
-              <w:spacing w:after="0"/>
-            </w:pPr>
-            <w:r>
-              <w:rPr>
-                <w:color w:val="1E293B"/>
-                <w:sz w:val="17"/>
-              </w:rPr>
-              <w:t>/status</w:t>
-            </w:r>
-          </w:p>
-        </w:tc>
-        <w:tc>
-          <w:tcPr>
-            <w:tcW w:type="dxa" w:w="2880"/>
-            <w:shd w:fill="ffffff"/>
-            <w:tcMar>
-              <w:top w:w="100" w:type="dxa"/>
-              <w:bottom w:w="100" w:type="dxa"/>
-              <w:left w:w="120" w:type="dxa"/>
-              <w:right w:w="120" w:type="dxa"/>
-            </w:tcMar>
-          </w:tcPr>
-          <w:p>
-            <w:pPr>
-              <w:spacing w:after="0"/>
-            </w:pPr>
-            <w:r>
-              <w:rPr>
-                <w:color w:val="1E293B"/>
-                <w:sz w:val="17"/>
-              </w:rPr>
-              <w:t>Status Bot &amp; Akun MT5</w:t>
-            </w:r>
-          </w:p>
-        </w:tc>
-        <w:tc>
-          <w:tcPr>
-            <w:tcW w:type="dxa" w:w="4608"/>
-            <w:shd w:fill="ffffff"/>
-            <w:tcMar>
-              <w:top w:w="100" w:type="dxa"/>
-              <w:bottom w:w="100" w:type="dxa"/>
-              <w:left w:w="120" w:type="dxa"/>
-              <w:right w:w="120" w:type="dxa"/>
-            </w:tcMar>
-          </w:tcPr>
-          <w:p>
-            <w:pPr>
-              <w:spacing w:after="0"/>
-            </w:pPr>
-            <w:r>
-              <w:rPr>
-                <w:color w:val="1E293B"/>
-                <w:sz w:val="17"/>
-              </w:rPr>
-              <w:t>Menampilkan saldo, equity, margin, daily P/L, dan status koneksi.</w:t>
-            </w:r>
-          </w:p>
-        </w:tc>
-      </w:tr>
-      <w:tr>
-        <w:tc>
-          <w:tcPr>
-            <w:tcW w:type="dxa" w:w="2160"/>
-            <w:shd w:fill="f8fafc"/>
-            <w:tcMar>
-              <w:top w:w="100" w:type="dxa"/>
-              <w:bottom w:w="100" w:type="dxa"/>
-              <w:left w:w="120" w:type="dxa"/>
-              <w:right w:w="120" w:type="dxa"/>
-            </w:tcMar>
-          </w:tcPr>
-          <w:p>
-            <w:pPr>
-              <w:spacing w:after="0"/>
-            </w:pPr>
-            <w:r>
-              <w:rPr>
-                <w:color w:val="1E293B"/>
-                <w:sz w:val="17"/>
-              </w:rPr>
-              <w:t>/posisi</w:t>
-            </w:r>
-          </w:p>
-        </w:tc>
-        <w:tc>
-          <w:tcPr>
-            <w:tcW w:type="dxa" w:w="2880"/>
-            <w:shd w:fill="f8fafc"/>
-            <w:tcMar>
-              <w:top w:w="100" w:type="dxa"/>
-              <w:bottom w:w="100" w:type="dxa"/>
-              <w:left w:w="120" w:type="dxa"/>
-              <w:right w:w="120" w:type="dxa"/>
-            </w:tcMar>
-          </w:tcPr>
-          <w:p>
-            <w:pPr>
-              <w:spacing w:after="0"/>
-            </w:pPr>
-            <w:r>
-              <w:rPr>
-                <w:color w:val="1E293B"/>
-                <w:sz w:val="17"/>
-              </w:rPr>
-              <w:t>Daftar Posisi Berjalan</w:t>
-            </w:r>
-          </w:p>
-        </w:tc>
-        <w:tc>
-          <w:tcPr>
-            <w:tcW w:type="dxa" w:w="4608"/>
-            <w:shd w:fill="f8fafc"/>
-            <w:tcMar>
-              <w:top w:w="100" w:type="dxa"/>
-              <w:bottom w:w="100" w:type="dxa"/>
-              <w:left w:w="120" w:type="dxa"/>
-              <w:right w:w="120" w:type="dxa"/>
-            </w:tcMar>
-          </w:tcPr>
-          <w:p>
-            <w:pPr>
-              <w:spacing w:after="0"/>
-            </w:pPr>
-            <w:r>
-              <w:rPr>
-                <w:color w:val="1E293B"/>
-                <w:sz w:val="17"/>
-              </w:rPr>
-              <w:t>Menampilkan tiket terbuka, floating P/L, status BEP, dan trailing stop.</w:t>
-            </w:r>
-          </w:p>
-        </w:tc>
-      </w:tr>
-      <w:tr>
-        <w:tc>
-          <w:tcPr>
-            <w:tcW w:type="dxa" w:w="2160"/>
-            <w:shd w:fill="ffffff"/>
-            <w:tcMar>
-              <w:top w:w="100" w:type="dxa"/>
-              <w:bottom w:w="100" w:type="dxa"/>
-              <w:left w:w="120" w:type="dxa"/>
-              <w:right w:w="120" w:type="dxa"/>
-            </w:tcMar>
-          </w:tcPr>
-          <w:p>
-            <w:pPr>
-              <w:spacing w:after="0"/>
-            </w:pPr>
-            <w:r>
-              <w:rPr>
-                <w:color w:val="1E293B"/>
-                <w:sz w:val="17"/>
-              </w:rPr>
-              <w:t>/radar</w:t>
-            </w:r>
-          </w:p>
-        </w:tc>
-        <w:tc>
-          <w:tcPr>
-            <w:tcW w:type="dxa" w:w="2880"/>
-            <w:shd w:fill="ffffff"/>
-            <w:tcMar>
-              <w:top w:w="100" w:type="dxa"/>
-              <w:bottom w:w="100" w:type="dxa"/>
-              <w:left w:w="120" w:type="dxa"/>
-              <w:right w:w="120" w:type="dxa"/>
-            </w:tcMar>
-          </w:tcPr>
-          <w:p>
-            <w:pPr>
-              <w:spacing w:after="0"/>
-            </w:pPr>
-            <w:r>
-              <w:rPr>
-                <w:color w:val="1E293B"/>
-                <w:sz w:val="17"/>
-              </w:rPr>
-              <w:t>Live Heat-Table 27 Simbol</w:t>
-            </w:r>
-          </w:p>
-        </w:tc>
-        <w:tc>
-          <w:tcPr>
-            <w:tcW w:type="dxa" w:w="4608"/>
-            <w:shd w:fill="ffffff"/>
-            <w:tcMar>
-              <w:top w:w="100" w:type="dxa"/>
-              <w:bottom w:w="100" w:type="dxa"/>
-              <w:left w:w="120" w:type="dxa"/>
-              <w:right w:w="120" w:type="dxa"/>
-            </w:tcMar>
-          </w:tcPr>
-          <w:p>
-            <w:pPr>
-              <w:spacing w:after="0"/>
-            </w:pPr>
-            <w:r>
-              <w:rPr>
-                <w:color w:val="1E293B"/>
-                <w:sz w:val="17"/>
-              </w:rPr>
-              <w:t>Menampilkan status Stage 1 Radar, Wave State, dan CSM permission.</w:t>
-            </w:r>
-          </w:p>
-        </w:tc>
-      </w:tr>
-      <w:tr>
-        <w:tc>
-          <w:tcPr>
-            <w:tcW w:type="dxa" w:w="2160"/>
-            <w:shd w:fill="f8fafc"/>
-            <w:tcMar>
-              <w:top w:w="100" w:type="dxa"/>
-              <w:bottom w:w="100" w:type="dxa"/>
-              <w:left w:w="120" w:type="dxa"/>
-              <w:right w:w="120" w:type="dxa"/>
-            </w:tcMar>
-          </w:tcPr>
-          <w:p>
-            <w:pPr>
-              <w:spacing w:after="0"/>
-            </w:pPr>
-            <w:r>
-              <w:rPr>
-                <w:color w:val="1E293B"/>
-                <w:sz w:val="17"/>
-              </w:rPr>
-              <w:t>/levels &lt;symbol&gt;</w:t>
-            </w:r>
-          </w:p>
-        </w:tc>
-        <w:tc>
-          <w:tcPr>
-            <w:tcW w:type="dxa" w:w="2880"/>
-            <w:shd w:fill="f8fafc"/>
-            <w:tcMar>
-              <w:top w:w="100" w:type="dxa"/>
-              <w:bottom w:w="100" w:type="dxa"/>
-              <w:left w:w="120" w:type="dxa"/>
-              <w:right w:w="120" w:type="dxa"/>
-            </w:tcMar>
-          </w:tcPr>
-          <w:p>
-            <w:pPr>
-              <w:spacing w:after="0"/>
-            </w:pPr>
-            <w:r>
-              <w:rPr>
-                <w:color w:val="1E293B"/>
-                <w:sz w:val="17"/>
-              </w:rPr>
-              <w:t>Peta Stasiun Atlas DNA</w:t>
-            </w:r>
-          </w:p>
-        </w:tc>
-        <w:tc>
-          <w:tcPr>
-            <w:tcW w:type="dxa" w:w="4608"/>
-            <w:shd w:fill="f8fafc"/>
-            <w:tcMar>
-              <w:top w:w="100" w:type="dxa"/>
-              <w:bottom w:w="100" w:type="dxa"/>
-              <w:left w:w="120" w:type="dxa"/>
-              <w:right w:w="120" w:type="dxa"/>
-            </w:tcMar>
-          </w:tcPr>
-          <w:p>
-            <w:pPr>
-              <w:spacing w:after="0"/>
-            </w:pPr>
-            <w:r>
-              <w:rPr>
-                <w:color w:val="1E293B"/>
-                <w:sz w:val="17"/>
-              </w:rPr>
-              <w:t>Menampilkan koridor stasiun psikologis 100-pip dan dealing range.</w:t>
-            </w:r>
-          </w:p>
-        </w:tc>
-      </w:tr>
-      <w:tr>
-        <w:tc>
-          <w:tcPr>
-            <w:tcW w:type="dxa" w:w="2160"/>
-            <w:shd w:fill="ffffff"/>
-            <w:tcMar>
-              <w:top w:w="100" w:type="dxa"/>
-              <w:bottom w:w="100" w:type="dxa"/>
-              <w:left w:w="120" w:type="dxa"/>
-              <w:right w:w="120" w:type="dxa"/>
-            </w:tcMar>
-          </w:tcPr>
-          <w:p>
-            <w:pPr>
-              <w:spacing w:after="0"/>
-            </w:pPr>
-            <w:r>
-              <w:rPr>
-                <w:color w:val="1E293B"/>
-                <w:sz w:val="17"/>
-              </w:rPr>
-              <w:t>/smc &lt;symbol&gt;</w:t>
-            </w:r>
-          </w:p>
-        </w:tc>
-        <w:tc>
-          <w:tcPr>
-            <w:tcW w:type="dxa" w:w="2880"/>
-            <w:shd w:fill="ffffff"/>
-            <w:tcMar>
-              <w:top w:w="100" w:type="dxa"/>
-              <w:bottom w:w="100" w:type="dxa"/>
-              <w:left w:w="120" w:type="dxa"/>
-              <w:right w:w="120" w:type="dxa"/>
-            </w:tcMar>
-          </w:tcPr>
-          <w:p>
-            <w:pPr>
-              <w:spacing w:after="0"/>
-            </w:pPr>
-            <w:r>
-              <w:rPr>
-                <w:color w:val="1E293B"/>
-                <w:sz w:val="17"/>
-              </w:rPr>
-              <w:t>Peta Likuiditas SMC</w:t>
-            </w:r>
-          </w:p>
-        </w:tc>
-        <w:tc>
-          <w:tcPr>
-            <w:tcW w:type="dxa" w:w="4608"/>
-            <w:shd w:fill="ffffff"/>
-            <w:tcMar>
-              <w:top w:w="100" w:type="dxa"/>
-              <w:bottom w:w="100" w:type="dxa"/>
-              <w:left w:w="120" w:type="dxa"/>
-              <w:right w:w="120" w:type="dxa"/>
-            </w:tcMar>
-          </w:tcPr>
-          <w:p>
-            <w:pPr>
-              <w:spacing w:after="0"/>
-            </w:pPr>
-            <w:r>
-              <w:rPr>
-                <w:color w:val="1E293B"/>
-                <w:sz w:val="17"/>
-              </w:rPr>
-              <w:t>Menampilkan Order Block aktif, Fair Value Gap, dan level EQH/EQL.</w:t>
-            </w:r>
-          </w:p>
-        </w:tc>
-      </w:tr>
-      <w:tr>
-        <w:tc>
-          <w:tcPr>
-            <w:tcW w:type="dxa" w:w="2160"/>
-            <w:shd w:fill="f8fafc"/>
-            <w:tcMar>
-              <w:top w:w="100" w:type="dxa"/>
-              <w:bottom w:w="100" w:type="dxa"/>
-              <w:left w:w="120" w:type="dxa"/>
-              <w:right w:w="120" w:type="dxa"/>
-            </w:tcMar>
-          </w:tcPr>
-          <w:p>
-            <w:pPr>
-              <w:spacing w:after="0"/>
-            </w:pPr>
-            <w:r>
-              <w:rPr>
-                <w:color w:val="1E293B"/>
-                <w:sz w:val="17"/>
-              </w:rPr>
-              <w:t>/macro &lt;symbol&gt;</w:t>
-            </w:r>
-          </w:p>
-        </w:tc>
-        <w:tc>
-          <w:tcPr>
-            <w:tcW w:type="dxa" w:w="2880"/>
-            <w:shd w:fill="f8fafc"/>
-            <w:tcMar>
-              <w:top w:w="100" w:type="dxa"/>
-              <w:bottom w:w="100" w:type="dxa"/>
-              <w:left w:w="120" w:type="dxa"/>
-              <w:right w:w="120" w:type="dxa"/>
-            </w:tcMar>
-          </w:tcPr>
-          <w:p>
-            <w:pPr>
-              <w:spacing w:after="0"/>
-            </w:pPr>
-            <w:r>
-              <w:rPr>
-                <w:color w:val="1E293B"/>
-                <w:sz w:val="17"/>
-              </w:rPr>
-              <w:t>Dossier 6-TF MSE</w:t>
-            </w:r>
-          </w:p>
-        </w:tc>
-        <w:tc>
-          <w:tcPr>
-            <w:tcW w:type="dxa" w:w="4608"/>
-            <w:shd w:fill="f8fafc"/>
-            <w:tcMar>
-              <w:top w:w="100" w:type="dxa"/>
-              <w:bottom w:w="100" w:type="dxa"/>
-              <w:left w:w="120" w:type="dxa"/>
-              <w:right w:w="120" w:type="dxa"/>
-            </w:tcMar>
-          </w:tcPr>
-          <w:p>
-            <w:pPr>
-              <w:spacing w:after="0"/>
-            </w:pPr>
-            <w:r>
-              <w:rPr>
-                <w:color w:val="1E293B"/>
-                <w:sz w:val="17"/>
-              </w:rPr>
-              <w:t>Menampilkan ringkasan komputasi Macro Strategic Engine 6-timeframe.</w:t>
-            </w:r>
-          </w:p>
-        </w:tc>
-      </w:tr>
-      <w:tr>
-        <w:tc>
-          <w:tcPr>
-            <w:tcW w:type="dxa" w:w="2160"/>
-            <w:shd w:fill="ffffff"/>
-            <w:tcMar>
-              <w:top w:w="100" w:type="dxa"/>
-              <w:bottom w:w="100" w:type="dxa"/>
-              <w:left w:w="120" w:type="dxa"/>
-              <w:right w:w="120" w:type="dxa"/>
-            </w:tcMar>
-          </w:tcPr>
-          <w:p>
-            <w:pPr>
-              <w:spacing w:after="0"/>
-            </w:pPr>
-            <w:r>
-              <w:rPr>
-                <w:color w:val="1E293B"/>
-                <w:sz w:val="17"/>
-              </w:rPr>
-              <w:t>/news</w:t>
-            </w:r>
-          </w:p>
-        </w:tc>
-        <w:tc>
-          <w:tcPr>
-            <w:tcW w:type="dxa" w:w="2880"/>
-            <w:shd w:fill="ffffff"/>
-            <w:tcMar>
-              <w:top w:w="100" w:type="dxa"/>
-              <w:bottom w:w="100" w:type="dxa"/>
-              <w:left w:w="120" w:type="dxa"/>
-              <w:right w:w="120" w:type="dxa"/>
-            </w:tcMar>
-          </w:tcPr>
-          <w:p>
-            <w:pPr>
-              <w:spacing w:after="0"/>
-            </w:pPr>
-            <w:r>
-              <w:rPr>
-                <w:color w:val="1E293B"/>
-                <w:sz w:val="17"/>
-              </w:rPr>
-              <w:t>Ticker Kalender Ekonomi</w:t>
-            </w:r>
-          </w:p>
-        </w:tc>
-        <w:tc>
-          <w:tcPr>
-            <w:tcW w:type="dxa" w:w="4608"/>
-            <w:shd w:fill="ffffff"/>
-            <w:tcMar>
-              <w:top w:w="100" w:type="dxa"/>
-              <w:bottom w:w="100" w:type="dxa"/>
-              <w:left w:w="120" w:type="dxa"/>
-              <w:right w:w="120" w:type="dxa"/>
-            </w:tcMar>
-          </w:tcPr>
-          <w:p>
-            <w:pPr>
-              <w:spacing w:after="0"/>
-            </w:pPr>
-            <w:r>
-              <w:rPr>
-                <w:color w:val="1E293B"/>
-                <w:sz w:val="17"/>
-              </w:rPr>
-              <w:t>Menampilkan rilis berita High-Impact mendatang dan countdown.</w:t>
-            </w:r>
-          </w:p>
-        </w:tc>
-      </w:tr>
-      <w:tr>
-        <w:tc>
-          <w:tcPr>
-            <w:tcW w:type="dxa" w:w="2160"/>
-            <w:shd w:fill="f8fafc"/>
-            <w:tcMar>
-              <w:top w:w="100" w:type="dxa"/>
-              <w:bottom w:w="100" w:type="dxa"/>
-              <w:left w:w="120" w:type="dxa"/>
-              <w:right w:w="120" w:type="dxa"/>
-            </w:tcMar>
-          </w:tcPr>
-          <w:p>
-            <w:pPr>
-              <w:spacing w:after="0"/>
-            </w:pPr>
-            <w:r>
-              <w:rPr>
-                <w:color w:val="1E293B"/>
-                <w:sz w:val="17"/>
-              </w:rPr>
-              <w:t>/analisa &lt;symbol&gt;</w:t>
-            </w:r>
-          </w:p>
-        </w:tc>
-        <w:tc>
-          <w:tcPr>
-            <w:tcW w:type="dxa" w:w="2880"/>
-            <w:shd w:fill="f8fafc"/>
-            <w:tcMar>
-              <w:top w:w="100" w:type="dxa"/>
-              <w:bottom w:w="100" w:type="dxa"/>
-              <w:left w:w="120" w:type="dxa"/>
-              <w:right w:w="120" w:type="dxa"/>
-            </w:tcMar>
-          </w:tcPr>
-          <w:p>
-            <w:pPr>
-              <w:spacing w:after="0"/>
-            </w:pPr>
-            <w:r>
-              <w:rPr>
-                <w:color w:val="1E293B"/>
-                <w:sz w:val="17"/>
-              </w:rPr>
-              <w:t>On-Demand 3-LLM Jury</w:t>
-            </w:r>
-          </w:p>
-        </w:tc>
-        <w:tc>
-          <w:tcPr>
-            <w:tcW w:type="dxa" w:w="4608"/>
-            <w:shd w:fill="f8fafc"/>
-            <w:tcMar>
-              <w:top w:w="100" w:type="dxa"/>
-              <w:bottom w:w="100" w:type="dxa"/>
-              <w:left w:w="120" w:type="dxa"/>
-              <w:right w:w="120" w:type="dxa"/>
-            </w:tcMar>
-          </w:tcPr>
-          <w:p>
-            <w:pPr>
-              <w:spacing w:after="0"/>
-            </w:pPr>
-            <w:r>
-              <w:rPr>
-                <w:color w:val="1E293B"/>
-                <w:sz w:val="17"/>
-              </w:rPr>
-              <w:t>Memanggil sidang juri 3 AI secara instan untuk simbol tertentu.</w:t>
-            </w:r>
-          </w:p>
-        </w:tc>
-      </w:tr>
-      <w:tr>
-        <w:tc>
-          <w:tcPr>
-            <w:tcW w:type="dxa" w:w="2160"/>
-            <w:shd w:fill="ffffff"/>
-            <w:tcMar>
-              <w:top w:w="100" w:type="dxa"/>
-              <w:bottom w:w="100" w:type="dxa"/>
-              <w:left w:w="120" w:type="dxa"/>
-              <w:right w:w="120" w:type="dxa"/>
-            </w:tcMar>
-          </w:tcPr>
-          <w:p>
-            <w:pPr>
-              <w:spacing w:after="0"/>
-            </w:pPr>
-            <w:r>
-              <w:rPr>
-                <w:color w:val="1E293B"/>
-                <w:sz w:val="17"/>
-              </w:rPr>
-              <w:t>/closeall</w:t>
-            </w:r>
-          </w:p>
-        </w:tc>
-        <w:tc>
-          <w:tcPr>
-            <w:tcW w:type="dxa" w:w="2880"/>
-            <w:shd w:fill="ffffff"/>
-            <w:tcMar>
-              <w:top w:w="100" w:type="dxa"/>
-              <w:bottom w:w="100" w:type="dxa"/>
-              <w:left w:w="120" w:type="dxa"/>
-              <w:right w:w="120" w:type="dxa"/>
-            </w:tcMar>
-          </w:tcPr>
-          <w:p>
-            <w:pPr>
-              <w:spacing w:after="0"/>
-            </w:pPr>
-            <w:r>
-              <w:rPr>
-                <w:color w:val="1E293B"/>
-                <w:sz w:val="17"/>
-              </w:rPr>
-              <w:t>Emergency Emergency Exit</w:t>
-            </w:r>
-          </w:p>
-        </w:tc>
-        <w:tc>
-          <w:tcPr>
-            <w:tcW w:type="dxa" w:w="4608"/>
-            <w:shd w:fill="ffffff"/>
-            <w:tcMar>
-              <w:top w:w="100" w:type="dxa"/>
-              <w:bottom w:w="100" w:type="dxa"/>
-              <w:left w:w="120" w:type="dxa"/>
-              <w:right w:w="120" w:type="dxa"/>
-            </w:tcMar>
-          </w:tcPr>
-          <w:p>
-            <w:pPr>
-              <w:spacing w:after="0"/>
-            </w:pPr>
-            <w:r>
-              <w:rPr>
-                <w:color w:val="1E293B"/>
-                <w:sz w:val="17"/>
-              </w:rPr>
-              <w:t>Menutup bersih seluruh posisi terbuka dan membatalkan semua pending order.</w:t>
-            </w:r>
-          </w:p>
-        </w:tc>
-      </w:tr>
-    </w:tbl>
     <w:sectPr>
       <w:pgSz w:w="12240" w:h="15840"/>
       <w:pgMar w:top="1152" w:right="1152" w:bottom="1152" w:left="1152" w:header="720" w:footer="720" w:gutter="0"/>

</xml_diff>